<commit_message>
Complete Phase 5 QA: fix Syracuse deadlines from official table
Re-verified Official sources, corrected Syracuse EA/ED1/ED2/RD
deadlines and notification dates, and recorded the QA checklist
in SOURCES.md. Regenerated the Word packet to match.

Co-authored-by: Junyi (Conny) Zhou <JunyiZhou-Conny@users.noreply.github.com>
</commit_message>
<xml_diff>
--- a/docs/supplemental-essays-and-plans-2026-27.docx
+++ b/docs/supplemental-essays-and-plans-2026-27.docx
@@ -2080,7 +2080,6 @@
                 <w:i w:val="0"/>
                 <w:sz w:val="18"/>
               </w:rPr>
-              <w:t>EDI/EA ~</w:t>
             </w:r>
             <w:r>
               <w:rPr>
@@ -2089,16 +2088,16 @@
                 <w:i w:val="0"/>
                 <w:sz w:val="18"/>
               </w:rPr>
-              <w:t>Nov 1</w:t>
-            </w:r>
-            <w:r>
-              <w:rPr>
-                <w:rFonts w:ascii="Calibri" w:hAnsi="Calibri" w:eastAsia="Calibri"/>
-                <w:b w:val="0"/>
-                <w:i w:val="0"/>
-                <w:sz w:val="18"/>
-              </w:rPr>
-              <w:t>; EDII/RD ~</w:t>
+              <w:t>EA/ED1 Nov 1</w:t>
+            </w:r>
+            <w:r>
+              <w:rPr>
+                <w:rFonts w:ascii="Calibri" w:hAnsi="Calibri" w:eastAsia="Calibri"/>
+                <w:b w:val="0"/>
+                <w:i w:val="0"/>
+                <w:sz w:val="18"/>
+              </w:rPr>
+              <w:t xml:space="preserve">; </w:t>
             </w:r>
             <w:r>
               <w:rPr>
@@ -2107,7 +2106,7 @@
                 <w:i w:val="0"/>
                 <w:sz w:val="18"/>
               </w:rPr>
-              <w:t>Jan 5</w:t>
+              <w:t>ED2/RD Jan 5</w:t>
             </w:r>
             <w:r>
               <w:rPr>
@@ -2132,7 +2131,7 @@
                 <w:i w:val="0"/>
                 <w:sz w:val="18"/>
               </w:rPr>
-              <w:t>Confirm column labels in portal</w:t>
+              <w:t>EA non-binding; ED binding</w:t>
             </w:r>
           </w:p>
         </w:tc>
@@ -8212,7 +8211,7 @@
           <w:i w:val="0"/>
           <w:sz w:val="22"/>
         </w:rPr>
-        <w:t xml:space="preserve"> ED1, Early Action (new for Fall 2027 cycle per Syracuse counselor communications), ED2, RD  </w:t>
+        <w:t xml:space="preserve"> Early Action (non-binding), Early Decision I (binding), Early Decision II (binding), Regular Decision  </w:t>
       </w:r>
     </w:p>
     <w:p>
@@ -8231,605 +8230,7 @@
           <w:i w:val="0"/>
           <w:sz w:val="22"/>
         </w:rPr>
-        <w:t>Deadlines (Official table on Syracuse deadlines page — confirm labels in portal):</w:t>
-      </w:r>
-      <w:r>
-        <w:rPr>
-          <w:rFonts w:ascii="Calibri" w:hAnsi="Calibri" w:eastAsia="Calibri"/>
-          <w:b w:val="0"/>
-          <w:i w:val="0"/>
-          <w:sz w:val="22"/>
-        </w:rPr>
-      </w:r>
-    </w:p>
-    <w:tbl>
-      <w:tblPr>
-        <w:tblStyle w:val="TableGrid"/>
-        <w:tblW w:type="auto" w:w="0"/>
-        <w:tblLook w:firstColumn="1" w:firstRow="1" w:lastColumn="0" w:lastRow="0" w:noHBand="0" w:noVBand="1" w:val="04A0"/>
-      </w:tblPr>
-      <w:tblGrid>
-        <w:gridCol w:w="4896"/>
-        <w:gridCol w:w="4896"/>
-      </w:tblGrid>
-      <w:tr>
-        <w:tc>
-          <w:tcPr>
-            <w:tcW w:type="dxa" w:w="4896"/>
-            <w:shd w:fill="1F4E79" w:val="clear"/>
-          </w:tcPr>
-          <w:p>
-            <w:r>
-              <w:rPr>
-                <w:b/>
-                <w:color w:val="FFFFFF"/>
-              </w:rPr>
-            </w:r>
-            <w:r>
-              <w:rPr>
-                <w:rFonts w:ascii="Calibri" w:hAnsi="Calibri" w:eastAsia="Calibri"/>
-                <w:b/>
-                <w:i w:val="0"/>
-                <w:color w:val="FFFFFF"/>
-                <w:sz w:val="18"/>
-              </w:rPr>
-              <w:t>Likely plan</w:t>
-            </w:r>
-          </w:p>
-        </w:tc>
-        <w:tc>
-          <w:tcPr>
-            <w:tcW w:type="dxa" w:w="4896"/>
-            <w:shd w:fill="1F4E79" w:val="clear"/>
-          </w:tcPr>
-          <w:p>
-            <w:r>
-              <w:rPr>
-                <w:b/>
-                <w:color w:val="FFFFFF"/>
-              </w:rPr>
-            </w:r>
-            <w:r>
-              <w:rPr>
-                <w:rFonts w:ascii="Calibri" w:hAnsi="Calibri" w:eastAsia="Calibri"/>
-                <w:b/>
-                <w:i w:val="0"/>
-                <w:color w:val="FFFFFF"/>
-                <w:sz w:val="18"/>
-              </w:rPr>
-              <w:t>Application deadline</w:t>
-            </w:r>
-          </w:p>
-        </w:tc>
-      </w:tr>
-      <w:tr>
-        <w:tc>
-          <w:tcPr>
-            <w:tcW w:type="dxa" w:w="4896"/>
-          </w:tcPr>
-          <w:p>
-            <w:r/>
-            <w:r>
-              <w:rPr>
-                <w:rFonts w:ascii="Calibri" w:hAnsi="Calibri" w:eastAsia="Calibri"/>
-                <w:b w:val="0"/>
-                <w:i w:val="0"/>
-                <w:sz w:val="18"/>
-              </w:rPr>
-              <w:t>Early Decision I / Early Action</w:t>
-            </w:r>
-          </w:p>
-        </w:tc>
-        <w:tc>
-          <w:tcPr>
-            <w:tcW w:type="dxa" w:w="4896"/>
-          </w:tcPr>
-          <w:p>
-            <w:r/>
-            <w:r>
-              <w:rPr>
-                <w:rFonts w:ascii="Calibri" w:hAnsi="Calibri" w:eastAsia="Calibri"/>
-                <w:b w:val="0"/>
-                <w:i w:val="0"/>
-                <w:sz w:val="18"/>
-              </w:rPr>
-            </w:r>
-            <w:r>
-              <w:rPr>
-                <w:rFonts w:ascii="Calibri" w:hAnsi="Calibri" w:eastAsia="Calibri"/>
-                <w:b/>
-                <w:i w:val="0"/>
-                <w:sz w:val="18"/>
-              </w:rPr>
-              <w:t>November 1</w:t>
-            </w:r>
-            <w:r>
-              <w:rPr>
-                <w:rFonts w:ascii="Calibri" w:hAnsi="Calibri" w:eastAsia="Calibri"/>
-                <w:b w:val="0"/>
-                <w:i w:val="0"/>
-                <w:sz w:val="18"/>
-              </w:rPr>
-            </w:r>
-          </w:p>
-        </w:tc>
-      </w:tr>
-      <w:tr>
-        <w:tc>
-          <w:tcPr>
-            <w:tcW w:type="dxa" w:w="4896"/>
-          </w:tcPr>
-          <w:p>
-            <w:r/>
-            <w:r>
-              <w:rPr>
-                <w:rFonts w:ascii="Calibri" w:hAnsi="Calibri" w:eastAsia="Calibri"/>
-                <w:b w:val="0"/>
-                <w:i w:val="0"/>
-                <w:sz w:val="18"/>
-              </w:rPr>
-              <w:t>Early Decision II / Regular Decision</w:t>
-            </w:r>
-          </w:p>
-        </w:tc>
-        <w:tc>
-          <w:tcPr>
-            <w:tcW w:type="dxa" w:w="4896"/>
-          </w:tcPr>
-          <w:p>
-            <w:r/>
-            <w:r>
-              <w:rPr>
-                <w:rFonts w:ascii="Calibri" w:hAnsi="Calibri" w:eastAsia="Calibri"/>
-                <w:b w:val="0"/>
-                <w:i w:val="0"/>
-                <w:sz w:val="18"/>
-              </w:rPr>
-            </w:r>
-            <w:r>
-              <w:rPr>
-                <w:rFonts w:ascii="Calibri" w:hAnsi="Calibri" w:eastAsia="Calibri"/>
-                <w:b/>
-                <w:i w:val="0"/>
-                <w:sz w:val="18"/>
-              </w:rPr>
-              <w:t>January 5</w:t>
-            </w:r>
-            <w:r>
-              <w:rPr>
-                <w:rFonts w:ascii="Calibri" w:hAnsi="Calibri" w:eastAsia="Calibri"/>
-                <w:b w:val="0"/>
-                <w:i w:val="0"/>
-                <w:sz w:val="18"/>
-              </w:rPr>
-            </w:r>
-          </w:p>
-        </w:tc>
-      </w:tr>
-    </w:tbl>
-    <w:p/>
-    <w:p>
-      <w:r>
-        <w:rPr>
-          <w:rFonts w:ascii="Calibri" w:hAnsi="Calibri" w:eastAsia="Calibri"/>
-          <w:b w:val="0"/>
-          <w:i w:val="0"/>
-          <w:sz w:val="22"/>
-        </w:rPr>
-      </w:r>
-      <w:r>
-        <w:rPr>
-          <w:rFonts w:ascii="Calibri" w:hAnsi="Calibri" w:eastAsia="Calibri"/>
-          <w:b/>
-          <w:i w:val="0"/>
-          <w:sz w:val="22"/>
-        </w:rPr>
-        <w:t>Supplemental essay — Cross-checked / Needs Login Confirmation</w:t>
-      </w:r>
-      <w:r>
-        <w:rPr>
-          <w:rFonts w:ascii="Calibri" w:hAnsi="Calibri" w:eastAsia="Calibri"/>
-          <w:b w:val="0"/>
-          <w:i w:val="0"/>
-          <w:sz w:val="22"/>
-        </w:rPr>
-        <w:t xml:space="preserve"> · </w:t>
-      </w:r>
-      <w:r>
-        <w:rPr>
-          <w:rFonts w:ascii="Calibri" w:hAnsi="Calibri" w:eastAsia="Calibri"/>
-          <w:b/>
-          <w:i w:val="0"/>
-          <w:sz w:val="22"/>
-        </w:rPr>
-        <w:t>~250 words · required</w:t>
-      </w:r>
-      <w:r>
-        <w:rPr>
-          <w:rFonts w:ascii="Calibri" w:hAnsi="Calibri" w:eastAsia="Calibri"/>
-          <w:b w:val="0"/>
-          <w:i w:val="0"/>
-          <w:sz w:val="22"/>
-        </w:rPr>
-        <w:t xml:space="preserve"> in recent cycles:</w:t>
-      </w:r>
-    </w:p>
-    <w:p>
-      <w:pPr>
-        <w:ind w:left="432"/>
-      </w:pPr>
-      <w:r>
-        <w:rPr>
-          <w:rFonts w:ascii="Calibri" w:hAnsi="Calibri" w:eastAsia="Calibri"/>
-          <w:b w:val="0"/>
-          <w:i/>
-          <w:sz w:val="22"/>
-        </w:rPr>
-        <w:t>Syracuse University is a place that seeks to be welcoming to all – and has been since our founding. Explain why you are interested in Syracuse University and describe a personal experience in which you persevered through adversity, rejected discrimination, learned a lesson, or were inspired by the courageous actions of others and how you will apply what you learned to our community in a positive way. (250 words)</w:t>
-      </w:r>
-    </w:p>
-    <w:p>
-      <w:r>
-        <w:rPr>
-          <w:rFonts w:ascii="Calibri" w:hAnsi="Calibri" w:eastAsia="Calibri"/>
-          <w:b w:val="0"/>
-          <w:i w:val="0"/>
-          <w:sz w:val="22"/>
-        </w:rPr>
-        <w:t>Confirm exact wording + limit in Common App Writing.</w:t>
-      </w:r>
-    </w:p>
-    <w:p>
-      <w:r>
-        <w:rPr>
-          <w:rFonts w:ascii="Calibri" w:hAnsi="Calibri" w:eastAsia="Calibri"/>
-          <w:b w:val="0"/>
-          <w:i w:val="0"/>
-          <w:sz w:val="18"/>
-        </w:rPr>
-        <w:t>────────────────────────────────────────</w:t>
-      </w:r>
-    </w:p>
-    <w:p>
-      <w:pPr>
-        <w:pStyle w:val="Heading2"/>
-      </w:pPr>
-      <w:r>
-        <w:t>Rutgers University–New Brunswick — RD</w:t>
-      </w:r>
-    </w:p>
-    <w:p>
-      <w:r>
-        <w:rPr>
-          <w:rFonts w:ascii="Calibri" w:hAnsi="Calibri" w:eastAsia="Calibri"/>
-          <w:b w:val="0"/>
-          <w:i w:val="0"/>
-          <w:sz w:val="22"/>
-        </w:rPr>
-      </w:r>
-      <w:r>
-        <w:rPr>
-          <w:rFonts w:ascii="Calibri" w:hAnsi="Calibri" w:eastAsia="Calibri"/>
-          <w:b/>
-          <w:i w:val="0"/>
-          <w:sz w:val="22"/>
-        </w:rPr>
-        <w:t>Plans &amp; deadlines (Official):</w:t>
-      </w:r>
-      <w:r>
-        <w:rPr>
-          <w:rFonts w:ascii="Calibri" w:hAnsi="Calibri" w:eastAsia="Calibri"/>
-          <w:b w:val="0"/>
-          <w:i w:val="0"/>
-          <w:sz w:val="22"/>
-        </w:rPr>
-      </w:r>
-    </w:p>
-    <w:tbl>
-      <w:tblPr>
-        <w:tblStyle w:val="TableGrid"/>
-        <w:tblW w:type="auto" w:w="0"/>
-        <w:tblLook w:firstColumn="1" w:firstRow="1" w:lastColumn="0" w:lastRow="0" w:noHBand="0" w:noVBand="1" w:val="04A0"/>
-      </w:tblPr>
-      <w:tblGrid>
-        <w:gridCol w:w="4896"/>
-        <w:gridCol w:w="4896"/>
-      </w:tblGrid>
-      <w:tr>
-        <w:tc>
-          <w:tcPr>
-            <w:tcW w:type="dxa" w:w="4896"/>
-            <w:shd w:fill="1F4E79" w:val="clear"/>
-          </w:tcPr>
-          <w:p>
-            <w:r>
-              <w:rPr>
-                <w:b/>
-                <w:color w:val="FFFFFF"/>
-              </w:rPr>
-            </w:r>
-            <w:r>
-              <w:rPr>
-                <w:rFonts w:ascii="Calibri" w:hAnsi="Calibri" w:eastAsia="Calibri"/>
-                <w:b/>
-                <w:i w:val="0"/>
-                <w:color w:val="FFFFFF"/>
-                <w:sz w:val="18"/>
-              </w:rPr>
-              <w:t>Plan</w:t>
-            </w:r>
-          </w:p>
-        </w:tc>
-        <w:tc>
-          <w:tcPr>
-            <w:tcW w:type="dxa" w:w="4896"/>
-            <w:shd w:fill="1F4E79" w:val="clear"/>
-          </w:tcPr>
-          <w:p>
-            <w:r>
-              <w:rPr>
-                <w:b/>
-                <w:color w:val="FFFFFF"/>
-              </w:rPr>
-            </w:r>
-            <w:r>
-              <w:rPr>
-                <w:rFonts w:ascii="Calibri" w:hAnsi="Calibri" w:eastAsia="Calibri"/>
-                <w:b/>
-                <w:i w:val="0"/>
-                <w:color w:val="FFFFFF"/>
-                <w:sz w:val="18"/>
-              </w:rPr>
-              <w:t>Deadline</w:t>
-            </w:r>
-          </w:p>
-        </w:tc>
-      </w:tr>
-      <w:tr>
-        <w:tc>
-          <w:tcPr>
-            <w:tcW w:type="dxa" w:w="4896"/>
-          </w:tcPr>
-          <w:p>
-            <w:r/>
-            <w:r>
-              <w:rPr>
-                <w:rFonts w:ascii="Calibri" w:hAnsi="Calibri" w:eastAsia="Calibri"/>
-                <w:b w:val="0"/>
-                <w:i w:val="0"/>
-                <w:sz w:val="18"/>
-              </w:rPr>
-              <w:t>Early Action (first-year)</w:t>
-            </w:r>
-          </w:p>
-        </w:tc>
-        <w:tc>
-          <w:tcPr>
-            <w:tcW w:type="dxa" w:w="4896"/>
-          </w:tcPr>
-          <w:p>
-            <w:r/>
-            <w:r>
-              <w:rPr>
-                <w:rFonts w:ascii="Calibri" w:hAnsi="Calibri" w:eastAsia="Calibri"/>
-                <w:b w:val="0"/>
-                <w:i w:val="0"/>
-                <w:sz w:val="18"/>
-              </w:rPr>
-            </w:r>
-            <w:r>
-              <w:rPr>
-                <w:rFonts w:ascii="Calibri" w:hAnsi="Calibri" w:eastAsia="Calibri"/>
-                <w:b/>
-                <w:i w:val="0"/>
-                <w:sz w:val="18"/>
-              </w:rPr>
-              <w:t>November 1</w:t>
-            </w:r>
-            <w:r>
-              <w:rPr>
-                <w:rFonts w:ascii="Calibri" w:hAnsi="Calibri" w:eastAsia="Calibri"/>
-                <w:b w:val="0"/>
-                <w:i w:val="0"/>
-                <w:sz w:val="18"/>
-              </w:rPr>
-            </w:r>
-          </w:p>
-        </w:tc>
-      </w:tr>
-      <w:tr>
-        <w:tc>
-          <w:tcPr>
-            <w:tcW w:type="dxa" w:w="4896"/>
-          </w:tcPr>
-          <w:p>
-            <w:r/>
-            <w:r>
-              <w:rPr>
-                <w:rFonts w:ascii="Calibri" w:hAnsi="Calibri" w:eastAsia="Calibri"/>
-                <w:b w:val="0"/>
-                <w:i w:val="0"/>
-                <w:sz w:val="18"/>
-              </w:rPr>
-              <w:t>Regular Decision (first-year)</w:t>
-            </w:r>
-          </w:p>
-        </w:tc>
-        <w:tc>
-          <w:tcPr>
-            <w:tcW w:type="dxa" w:w="4896"/>
-          </w:tcPr>
-          <w:p>
-            <w:r/>
-            <w:r>
-              <w:rPr>
-                <w:rFonts w:ascii="Calibri" w:hAnsi="Calibri" w:eastAsia="Calibri"/>
-                <w:b w:val="0"/>
-                <w:i w:val="0"/>
-                <w:sz w:val="18"/>
-              </w:rPr>
-            </w:r>
-            <w:r>
-              <w:rPr>
-                <w:rFonts w:ascii="Calibri" w:hAnsi="Calibri" w:eastAsia="Calibri"/>
-                <w:b/>
-                <w:i w:val="0"/>
-                <w:sz w:val="18"/>
-              </w:rPr>
-              <w:t>December 1</w:t>
-            </w:r>
-            <w:r>
-              <w:rPr>
-                <w:rFonts w:ascii="Calibri" w:hAnsi="Calibri" w:eastAsia="Calibri"/>
-                <w:b w:val="0"/>
-                <w:i w:val="0"/>
-                <w:sz w:val="18"/>
-              </w:rPr>
-            </w:r>
-          </w:p>
-        </w:tc>
-      </w:tr>
-    </w:tbl>
-    <w:p/>
-    <w:p>
-      <w:r>
-        <w:rPr>
-          <w:rFonts w:ascii="Calibri" w:hAnsi="Calibri" w:eastAsia="Calibri"/>
-          <w:b w:val="0"/>
-          <w:i w:val="0"/>
-          <w:sz w:val="22"/>
-        </w:rPr>
-      </w:r>
-      <w:r>
-        <w:rPr>
-          <w:rFonts w:ascii="Calibri" w:hAnsi="Calibri" w:eastAsia="Calibri"/>
-          <w:b/>
-          <w:i w:val="0"/>
-          <w:sz w:val="22"/>
-        </w:rPr>
-        <w:t>Writing:</w:t>
-      </w:r>
-      <w:r>
-        <w:rPr>
-          <w:rFonts w:ascii="Calibri" w:hAnsi="Calibri" w:eastAsia="Calibri"/>
-          <w:b w:val="0"/>
-          <w:i w:val="0"/>
-          <w:sz w:val="22"/>
-        </w:rPr>
-        <w:t xml:space="preserve"> Rutgers reviews an </w:t>
-      </w:r>
-      <w:r>
-        <w:rPr>
-          <w:rFonts w:ascii="Calibri" w:hAnsi="Calibri" w:eastAsia="Calibri"/>
-          <w:b/>
-          <w:i w:val="0"/>
-          <w:sz w:val="22"/>
-        </w:rPr>
-        <w:t>essay</w:t>
-      </w:r>
-      <w:r>
-        <w:rPr>
-          <w:rFonts w:ascii="Calibri" w:hAnsi="Calibri" w:eastAsia="Calibri"/>
-          <w:b w:val="0"/>
-          <w:i w:val="0"/>
-          <w:sz w:val="22"/>
-        </w:rPr>
-        <w:t xml:space="preserve"> as part of holistic review. On Common App, complete whatever Rutgers-specific writing questions appear (often the shared personal statement plus any Rutgers short responses).  </w:t>
-      </w:r>
-    </w:p>
-    <w:p>
-      <w:r>
-        <w:rPr>
-          <w:rFonts w:ascii="Calibri" w:hAnsi="Calibri" w:eastAsia="Calibri"/>
-          <w:b w:val="0"/>
-          <w:i w:val="0"/>
-          <w:sz w:val="22"/>
-        </w:rPr>
-      </w:r>
-      <w:r>
-        <w:rPr>
-          <w:rFonts w:ascii="Calibri" w:hAnsi="Calibri" w:eastAsia="Calibri"/>
-          <w:b/>
-          <w:i w:val="0"/>
-          <w:sz w:val="22"/>
-        </w:rPr>
-        <w:t>Confidence:</w:t>
-      </w:r>
-      <w:r>
-        <w:rPr>
-          <w:rFonts w:ascii="Calibri" w:hAnsi="Calibri" w:eastAsia="Calibri"/>
-          <w:b w:val="0"/>
-          <w:i w:val="0"/>
-          <w:sz w:val="22"/>
-        </w:rPr>
-        <w:t xml:space="preserve"> Official that an essay is reviewed; </w:t>
-      </w:r>
-      <w:r>
-        <w:rPr>
-          <w:rFonts w:ascii="Calibri" w:hAnsi="Calibri" w:eastAsia="Calibri"/>
-          <w:b/>
-          <w:i w:val="0"/>
-          <w:sz w:val="22"/>
-        </w:rPr>
-        <w:t>Needs Login Confirmation</w:t>
-      </w:r>
-      <w:r>
-        <w:rPr>
-          <w:rFonts w:ascii="Calibri" w:hAnsi="Calibri" w:eastAsia="Calibri"/>
-          <w:b w:val="0"/>
-          <w:i w:val="0"/>
-          <w:sz w:val="22"/>
-        </w:rPr>
-        <w:t xml:space="preserve"> for any Rutgers-only prompt text/limits.</w:t>
-      </w:r>
-    </w:p>
-    <w:p>
-      <w:r>
-        <w:rPr>
-          <w:rFonts w:ascii="Calibri" w:hAnsi="Calibri" w:eastAsia="Calibri"/>
-          <w:b w:val="0"/>
-          <w:i w:val="0"/>
-          <w:sz w:val="22"/>
-        </w:rPr>
-        <w:t>No separate long “Why Rutgers” supplement is commonly required beyond application questions — verify in portal.</w:t>
-      </w:r>
-    </w:p>
-    <w:p>
-      <w:r>
-        <w:rPr>
-          <w:rFonts w:ascii="Calibri" w:hAnsi="Calibri" w:eastAsia="Calibri"/>
-          <w:b w:val="0"/>
-          <w:i w:val="0"/>
-          <w:sz w:val="18"/>
-        </w:rPr>
-        <w:t>────────────────────────────────────────</w:t>
-      </w:r>
-    </w:p>
-    <w:p>
-      <w:pPr>
-        <w:pStyle w:val="Heading2"/>
-      </w:pPr>
-      <w:r>
-        <w:t>University of Rhode Island — RD</w:t>
-      </w:r>
-    </w:p>
-    <w:p>
-      <w:r>
-        <w:rPr>
-          <w:rFonts w:ascii="Calibri" w:hAnsi="Calibri" w:eastAsia="Calibri"/>
-          <w:b w:val="0"/>
-          <w:i w:val="0"/>
-          <w:sz w:val="22"/>
-        </w:rPr>
-      </w:r>
-      <w:r>
-        <w:rPr>
-          <w:rFonts w:ascii="Calibri" w:hAnsi="Calibri" w:eastAsia="Calibri"/>
-          <w:b/>
-          <w:i w:val="0"/>
-          <w:sz w:val="22"/>
-        </w:rPr>
-        <w:t>Plans &amp; deadlines (Official — uri.edu/admission/first-year):</w:t>
+        <w:t>Deadlines (Official — Syracuse undergraduate deadlines table):</w:t>
       </w:r>
       <w:r>
         <w:rPr>
@@ -8897,6 +8298,895 @@
                 <w:color w:val="FFFFFF"/>
                 <w:sz w:val="18"/>
               </w:rPr>
+              <w:t>Application deadline</w:t>
+            </w:r>
+          </w:p>
+        </w:tc>
+        <w:tc>
+          <w:tcPr>
+            <w:tcW w:type="dxa" w:w="2448"/>
+            <w:shd w:fill="1F4E79" w:val="clear"/>
+          </w:tcPr>
+          <w:p>
+            <w:r>
+              <w:rPr>
+                <w:b/>
+                <w:color w:val="FFFFFF"/>
+              </w:rPr>
+            </w:r>
+            <w:r>
+              <w:rPr>
+                <w:rFonts w:ascii="Calibri" w:hAnsi="Calibri" w:eastAsia="Calibri"/>
+                <w:b/>
+                <w:i w:val="0"/>
+                <w:color w:val="FFFFFF"/>
+                <w:sz w:val="18"/>
+              </w:rPr>
+              <w:t>Notification begins</w:t>
+            </w:r>
+          </w:p>
+        </w:tc>
+        <w:tc>
+          <w:tcPr>
+            <w:tcW w:type="dxa" w:w="2448"/>
+            <w:shd w:fill="1F4E79" w:val="clear"/>
+          </w:tcPr>
+          <w:p>
+            <w:r>
+              <w:rPr>
+                <w:b/>
+                <w:color w:val="FFFFFF"/>
+              </w:rPr>
+            </w:r>
+            <w:r>
+              <w:rPr>
+                <w:rFonts w:ascii="Calibri" w:hAnsi="Calibri" w:eastAsia="Calibri"/>
+                <w:b/>
+                <w:i w:val="0"/>
+                <w:color w:val="FFFFFF"/>
+                <w:sz w:val="18"/>
+              </w:rPr>
+              <w:t>Reply date</w:t>
+            </w:r>
+          </w:p>
+        </w:tc>
+      </w:tr>
+      <w:tr>
+        <w:tc>
+          <w:tcPr>
+            <w:tcW w:type="dxa" w:w="2448"/>
+          </w:tcPr>
+          <w:p>
+            <w:r/>
+            <w:r>
+              <w:rPr>
+                <w:rFonts w:ascii="Calibri" w:hAnsi="Calibri" w:eastAsia="Calibri"/>
+                <w:b w:val="0"/>
+                <w:i w:val="0"/>
+                <w:sz w:val="18"/>
+              </w:rPr>
+              <w:t>Early Action</w:t>
+            </w:r>
+          </w:p>
+        </w:tc>
+        <w:tc>
+          <w:tcPr>
+            <w:tcW w:type="dxa" w:w="2448"/>
+          </w:tcPr>
+          <w:p>
+            <w:r/>
+            <w:r>
+              <w:rPr>
+                <w:rFonts w:ascii="Calibri" w:hAnsi="Calibri" w:eastAsia="Calibri"/>
+                <w:b w:val="0"/>
+                <w:i w:val="0"/>
+                <w:sz w:val="18"/>
+              </w:rPr>
+            </w:r>
+            <w:r>
+              <w:rPr>
+                <w:rFonts w:ascii="Calibri" w:hAnsi="Calibri" w:eastAsia="Calibri"/>
+                <w:b/>
+                <w:i w:val="0"/>
+                <w:sz w:val="18"/>
+              </w:rPr>
+              <w:t>November 1</w:t>
+            </w:r>
+            <w:r>
+              <w:rPr>
+                <w:rFonts w:ascii="Calibri" w:hAnsi="Calibri" w:eastAsia="Calibri"/>
+                <w:b w:val="0"/>
+                <w:i w:val="0"/>
+                <w:sz w:val="18"/>
+              </w:rPr>
+            </w:r>
+          </w:p>
+        </w:tc>
+        <w:tc>
+          <w:tcPr>
+            <w:tcW w:type="dxa" w:w="2448"/>
+          </w:tcPr>
+          <w:p>
+            <w:r/>
+            <w:r>
+              <w:rPr>
+                <w:rFonts w:ascii="Calibri" w:hAnsi="Calibri" w:eastAsia="Calibri"/>
+                <w:b w:val="0"/>
+                <w:i w:val="0"/>
+                <w:sz w:val="18"/>
+              </w:rPr>
+              <w:t>Early February</w:t>
+            </w:r>
+          </w:p>
+        </w:tc>
+        <w:tc>
+          <w:tcPr>
+            <w:tcW w:type="dxa" w:w="2448"/>
+          </w:tcPr>
+          <w:p>
+            <w:r/>
+            <w:r>
+              <w:rPr>
+                <w:rFonts w:ascii="Calibri" w:hAnsi="Calibri" w:eastAsia="Calibri"/>
+                <w:b w:val="0"/>
+                <w:i w:val="0"/>
+                <w:sz w:val="18"/>
+              </w:rPr>
+              <w:t>May 1</w:t>
+            </w:r>
+          </w:p>
+        </w:tc>
+      </w:tr>
+      <w:tr>
+        <w:tc>
+          <w:tcPr>
+            <w:tcW w:type="dxa" w:w="2448"/>
+          </w:tcPr>
+          <w:p>
+            <w:r/>
+            <w:r>
+              <w:rPr>
+                <w:rFonts w:ascii="Calibri" w:hAnsi="Calibri" w:eastAsia="Calibri"/>
+                <w:b w:val="0"/>
+                <w:i w:val="0"/>
+                <w:sz w:val="18"/>
+              </w:rPr>
+              <w:t>Early Decision I</w:t>
+            </w:r>
+          </w:p>
+        </w:tc>
+        <w:tc>
+          <w:tcPr>
+            <w:tcW w:type="dxa" w:w="2448"/>
+          </w:tcPr>
+          <w:p>
+            <w:r/>
+            <w:r>
+              <w:rPr>
+                <w:rFonts w:ascii="Calibri" w:hAnsi="Calibri" w:eastAsia="Calibri"/>
+                <w:b w:val="0"/>
+                <w:i w:val="0"/>
+                <w:sz w:val="18"/>
+              </w:rPr>
+            </w:r>
+            <w:r>
+              <w:rPr>
+                <w:rFonts w:ascii="Calibri" w:hAnsi="Calibri" w:eastAsia="Calibri"/>
+                <w:b/>
+                <w:i w:val="0"/>
+                <w:sz w:val="18"/>
+              </w:rPr>
+              <w:t>November 1</w:t>
+            </w:r>
+            <w:r>
+              <w:rPr>
+                <w:rFonts w:ascii="Calibri" w:hAnsi="Calibri" w:eastAsia="Calibri"/>
+                <w:b w:val="0"/>
+                <w:i w:val="0"/>
+                <w:sz w:val="18"/>
+              </w:rPr>
+            </w:r>
+          </w:p>
+        </w:tc>
+        <w:tc>
+          <w:tcPr>
+            <w:tcW w:type="dxa" w:w="2448"/>
+          </w:tcPr>
+          <w:p>
+            <w:r/>
+            <w:r>
+              <w:rPr>
+                <w:rFonts w:ascii="Calibri" w:hAnsi="Calibri" w:eastAsia="Calibri"/>
+                <w:b w:val="0"/>
+                <w:i w:val="0"/>
+                <w:sz w:val="18"/>
+              </w:rPr>
+              <w:t>Late December</w:t>
+            </w:r>
+          </w:p>
+        </w:tc>
+        <w:tc>
+          <w:tcPr>
+            <w:tcW w:type="dxa" w:w="2448"/>
+          </w:tcPr>
+          <w:p>
+            <w:r/>
+            <w:r>
+              <w:rPr>
+                <w:rFonts w:ascii="Calibri" w:hAnsi="Calibri" w:eastAsia="Calibri"/>
+                <w:b w:val="0"/>
+                <w:i w:val="0"/>
+                <w:sz w:val="18"/>
+              </w:rPr>
+              <w:t>Feb 15 (first-choice admit)</w:t>
+            </w:r>
+          </w:p>
+        </w:tc>
+      </w:tr>
+      <w:tr>
+        <w:tc>
+          <w:tcPr>
+            <w:tcW w:type="dxa" w:w="2448"/>
+          </w:tcPr>
+          <w:p>
+            <w:r/>
+            <w:r>
+              <w:rPr>
+                <w:rFonts w:ascii="Calibri" w:hAnsi="Calibri" w:eastAsia="Calibri"/>
+                <w:b w:val="0"/>
+                <w:i w:val="0"/>
+                <w:sz w:val="18"/>
+              </w:rPr>
+              <w:t>Early Decision II</w:t>
+            </w:r>
+          </w:p>
+        </w:tc>
+        <w:tc>
+          <w:tcPr>
+            <w:tcW w:type="dxa" w:w="2448"/>
+          </w:tcPr>
+          <w:p>
+            <w:r/>
+            <w:r>
+              <w:rPr>
+                <w:rFonts w:ascii="Calibri" w:hAnsi="Calibri" w:eastAsia="Calibri"/>
+                <w:b w:val="0"/>
+                <w:i w:val="0"/>
+                <w:sz w:val="18"/>
+              </w:rPr>
+            </w:r>
+            <w:r>
+              <w:rPr>
+                <w:rFonts w:ascii="Calibri" w:hAnsi="Calibri" w:eastAsia="Calibri"/>
+                <w:b/>
+                <w:i w:val="0"/>
+                <w:sz w:val="18"/>
+              </w:rPr>
+              <w:t>January 5</w:t>
+            </w:r>
+            <w:r>
+              <w:rPr>
+                <w:rFonts w:ascii="Calibri" w:hAnsi="Calibri" w:eastAsia="Calibri"/>
+                <w:b w:val="0"/>
+                <w:i w:val="0"/>
+                <w:sz w:val="18"/>
+              </w:rPr>
+            </w:r>
+          </w:p>
+        </w:tc>
+        <w:tc>
+          <w:tcPr>
+            <w:tcW w:type="dxa" w:w="2448"/>
+          </w:tcPr>
+          <w:p>
+            <w:r/>
+            <w:r>
+              <w:rPr>
+                <w:rFonts w:ascii="Calibri" w:hAnsi="Calibri" w:eastAsia="Calibri"/>
+                <w:b w:val="0"/>
+                <w:i w:val="0"/>
+                <w:sz w:val="18"/>
+              </w:rPr>
+              <w:t>Mid-January</w:t>
+            </w:r>
+          </w:p>
+        </w:tc>
+        <w:tc>
+          <w:tcPr>
+            <w:tcW w:type="dxa" w:w="2448"/>
+          </w:tcPr>
+          <w:p>
+            <w:r/>
+            <w:r>
+              <w:rPr>
+                <w:rFonts w:ascii="Calibri" w:hAnsi="Calibri" w:eastAsia="Calibri"/>
+                <w:b w:val="0"/>
+                <w:i w:val="0"/>
+                <w:sz w:val="18"/>
+              </w:rPr>
+              <w:t>March 1 (first-choice admit)</w:t>
+            </w:r>
+          </w:p>
+        </w:tc>
+      </w:tr>
+      <w:tr>
+        <w:tc>
+          <w:tcPr>
+            <w:tcW w:type="dxa" w:w="2448"/>
+          </w:tcPr>
+          <w:p>
+            <w:r/>
+            <w:r>
+              <w:rPr>
+                <w:rFonts w:ascii="Calibri" w:hAnsi="Calibri" w:eastAsia="Calibri"/>
+                <w:b w:val="0"/>
+                <w:i w:val="0"/>
+                <w:sz w:val="18"/>
+              </w:rPr>
+              <w:t>Regular Decision</w:t>
+            </w:r>
+          </w:p>
+        </w:tc>
+        <w:tc>
+          <w:tcPr>
+            <w:tcW w:type="dxa" w:w="2448"/>
+          </w:tcPr>
+          <w:p>
+            <w:r/>
+            <w:r>
+              <w:rPr>
+                <w:rFonts w:ascii="Calibri" w:hAnsi="Calibri" w:eastAsia="Calibri"/>
+                <w:b w:val="0"/>
+                <w:i w:val="0"/>
+                <w:sz w:val="18"/>
+              </w:rPr>
+            </w:r>
+            <w:r>
+              <w:rPr>
+                <w:rFonts w:ascii="Calibri" w:hAnsi="Calibri" w:eastAsia="Calibri"/>
+                <w:b/>
+                <w:i w:val="0"/>
+                <w:sz w:val="18"/>
+              </w:rPr>
+              <w:t>January 5</w:t>
+            </w:r>
+            <w:r>
+              <w:rPr>
+                <w:rFonts w:ascii="Calibri" w:hAnsi="Calibri" w:eastAsia="Calibri"/>
+                <w:b w:val="0"/>
+                <w:i w:val="0"/>
+                <w:sz w:val="18"/>
+              </w:rPr>
+              <w:t xml:space="preserve"> (first-year)</w:t>
+            </w:r>
+          </w:p>
+        </w:tc>
+        <w:tc>
+          <w:tcPr>
+            <w:tcW w:type="dxa" w:w="2448"/>
+          </w:tcPr>
+          <w:p>
+            <w:r/>
+            <w:r>
+              <w:rPr>
+                <w:rFonts w:ascii="Calibri" w:hAnsi="Calibri" w:eastAsia="Calibri"/>
+                <w:b w:val="0"/>
+                <w:i w:val="0"/>
+                <w:sz w:val="18"/>
+              </w:rPr>
+              <w:t>Mid-March</w:t>
+            </w:r>
+          </w:p>
+        </w:tc>
+        <w:tc>
+          <w:tcPr>
+            <w:tcW w:type="dxa" w:w="2448"/>
+          </w:tcPr>
+          <w:p>
+            <w:r/>
+            <w:r>
+              <w:rPr>
+                <w:rFonts w:ascii="Calibri" w:hAnsi="Calibri" w:eastAsia="Calibri"/>
+                <w:b w:val="0"/>
+                <w:i w:val="0"/>
+                <w:sz w:val="18"/>
+              </w:rPr>
+              <w:t>May 1</w:t>
+            </w:r>
+          </w:p>
+        </w:tc>
+      </w:tr>
+    </w:tbl>
+    <w:p/>
+    <w:p>
+      <w:r>
+        <w:rPr>
+          <w:rFonts w:ascii="Calibri" w:hAnsi="Calibri" w:eastAsia="Calibri"/>
+          <w:b w:val="0"/>
+          <w:i w:val="0"/>
+          <w:sz w:val="22"/>
+        </w:rPr>
+      </w:r>
+      <w:r>
+        <w:rPr>
+          <w:rFonts w:ascii="Calibri" w:hAnsi="Calibri" w:eastAsia="Calibri"/>
+          <w:b/>
+          <w:i w:val="0"/>
+          <w:sz w:val="22"/>
+        </w:rPr>
+        <w:t>Supplemental essay — Cross-checked / Needs Login Confirmation</w:t>
+      </w:r>
+      <w:r>
+        <w:rPr>
+          <w:rFonts w:ascii="Calibri" w:hAnsi="Calibri" w:eastAsia="Calibri"/>
+          <w:b w:val="0"/>
+          <w:i w:val="0"/>
+          <w:sz w:val="22"/>
+        </w:rPr>
+        <w:t xml:space="preserve"> · </w:t>
+      </w:r>
+      <w:r>
+        <w:rPr>
+          <w:rFonts w:ascii="Calibri" w:hAnsi="Calibri" w:eastAsia="Calibri"/>
+          <w:b/>
+          <w:i w:val="0"/>
+          <w:sz w:val="22"/>
+        </w:rPr>
+        <w:t>~250 words · required</w:t>
+      </w:r>
+      <w:r>
+        <w:rPr>
+          <w:rFonts w:ascii="Calibri" w:hAnsi="Calibri" w:eastAsia="Calibri"/>
+          <w:b w:val="0"/>
+          <w:i w:val="0"/>
+          <w:sz w:val="22"/>
+        </w:rPr>
+        <w:t xml:space="preserve"> in recent cycles:</w:t>
+      </w:r>
+    </w:p>
+    <w:p>
+      <w:pPr>
+        <w:ind w:left="432"/>
+      </w:pPr>
+      <w:r>
+        <w:rPr>
+          <w:rFonts w:ascii="Calibri" w:hAnsi="Calibri" w:eastAsia="Calibri"/>
+          <w:b w:val="0"/>
+          <w:i/>
+          <w:sz w:val="22"/>
+        </w:rPr>
+        <w:t>Syracuse University is a place that seeks to be welcoming to all – and has been since our founding. Explain why you are interested in Syracuse University and describe a personal experience in which you persevered through adversity, rejected discrimination, learned a lesson, or were inspired by the courageous actions of others and how you will apply what you learned to our community in a positive way. (250 words)</w:t>
+      </w:r>
+    </w:p>
+    <w:p>
+      <w:r>
+        <w:rPr>
+          <w:rFonts w:ascii="Calibri" w:hAnsi="Calibri" w:eastAsia="Calibri"/>
+          <w:b w:val="0"/>
+          <w:i w:val="0"/>
+          <w:sz w:val="22"/>
+        </w:rPr>
+        <w:t>Confirm exact wording + limit in Common App Writing.</w:t>
+      </w:r>
+    </w:p>
+    <w:p>
+      <w:r>
+        <w:rPr>
+          <w:rFonts w:ascii="Calibri" w:hAnsi="Calibri" w:eastAsia="Calibri"/>
+          <w:b w:val="0"/>
+          <w:i w:val="0"/>
+          <w:sz w:val="18"/>
+        </w:rPr>
+        <w:t>────────────────────────────────────────</w:t>
+      </w:r>
+    </w:p>
+    <w:p>
+      <w:pPr>
+        <w:pStyle w:val="Heading2"/>
+      </w:pPr>
+      <w:r>
+        <w:t>Rutgers University–New Brunswick — RD</w:t>
+      </w:r>
+    </w:p>
+    <w:p>
+      <w:r>
+        <w:rPr>
+          <w:rFonts w:ascii="Calibri" w:hAnsi="Calibri" w:eastAsia="Calibri"/>
+          <w:b w:val="0"/>
+          <w:i w:val="0"/>
+          <w:sz w:val="22"/>
+        </w:rPr>
+      </w:r>
+      <w:r>
+        <w:rPr>
+          <w:rFonts w:ascii="Calibri" w:hAnsi="Calibri" w:eastAsia="Calibri"/>
+          <w:b/>
+          <w:i w:val="0"/>
+          <w:sz w:val="22"/>
+        </w:rPr>
+        <w:t>Plans &amp; deadlines (Official):</w:t>
+      </w:r>
+      <w:r>
+        <w:rPr>
+          <w:rFonts w:ascii="Calibri" w:hAnsi="Calibri" w:eastAsia="Calibri"/>
+          <w:b w:val="0"/>
+          <w:i w:val="0"/>
+          <w:sz w:val="22"/>
+        </w:rPr>
+      </w:r>
+    </w:p>
+    <w:tbl>
+      <w:tblPr>
+        <w:tblStyle w:val="TableGrid"/>
+        <w:tblW w:type="auto" w:w="0"/>
+        <w:tblLook w:firstColumn="1" w:firstRow="1" w:lastColumn="0" w:lastRow="0" w:noHBand="0" w:noVBand="1" w:val="04A0"/>
+      </w:tblPr>
+      <w:tblGrid>
+        <w:gridCol w:w="4896"/>
+        <w:gridCol w:w="4896"/>
+      </w:tblGrid>
+      <w:tr>
+        <w:tc>
+          <w:tcPr>
+            <w:tcW w:type="dxa" w:w="4896"/>
+            <w:shd w:fill="1F4E79" w:val="clear"/>
+          </w:tcPr>
+          <w:p>
+            <w:r>
+              <w:rPr>
+                <w:b/>
+                <w:color w:val="FFFFFF"/>
+              </w:rPr>
+            </w:r>
+            <w:r>
+              <w:rPr>
+                <w:rFonts w:ascii="Calibri" w:hAnsi="Calibri" w:eastAsia="Calibri"/>
+                <w:b/>
+                <w:i w:val="0"/>
+                <w:color w:val="FFFFFF"/>
+                <w:sz w:val="18"/>
+              </w:rPr>
+              <w:t>Plan</w:t>
+            </w:r>
+          </w:p>
+        </w:tc>
+        <w:tc>
+          <w:tcPr>
+            <w:tcW w:type="dxa" w:w="4896"/>
+            <w:shd w:fill="1F4E79" w:val="clear"/>
+          </w:tcPr>
+          <w:p>
+            <w:r>
+              <w:rPr>
+                <w:b/>
+                <w:color w:val="FFFFFF"/>
+              </w:rPr>
+            </w:r>
+            <w:r>
+              <w:rPr>
+                <w:rFonts w:ascii="Calibri" w:hAnsi="Calibri" w:eastAsia="Calibri"/>
+                <w:b/>
+                <w:i w:val="0"/>
+                <w:color w:val="FFFFFF"/>
+                <w:sz w:val="18"/>
+              </w:rPr>
+              <w:t>Deadline</w:t>
+            </w:r>
+          </w:p>
+        </w:tc>
+      </w:tr>
+      <w:tr>
+        <w:tc>
+          <w:tcPr>
+            <w:tcW w:type="dxa" w:w="4896"/>
+          </w:tcPr>
+          <w:p>
+            <w:r/>
+            <w:r>
+              <w:rPr>
+                <w:rFonts w:ascii="Calibri" w:hAnsi="Calibri" w:eastAsia="Calibri"/>
+                <w:b w:val="0"/>
+                <w:i w:val="0"/>
+                <w:sz w:val="18"/>
+              </w:rPr>
+              <w:t>Early Action (first-year)</w:t>
+            </w:r>
+          </w:p>
+        </w:tc>
+        <w:tc>
+          <w:tcPr>
+            <w:tcW w:type="dxa" w:w="4896"/>
+          </w:tcPr>
+          <w:p>
+            <w:r/>
+            <w:r>
+              <w:rPr>
+                <w:rFonts w:ascii="Calibri" w:hAnsi="Calibri" w:eastAsia="Calibri"/>
+                <w:b w:val="0"/>
+                <w:i w:val="0"/>
+                <w:sz w:val="18"/>
+              </w:rPr>
+            </w:r>
+            <w:r>
+              <w:rPr>
+                <w:rFonts w:ascii="Calibri" w:hAnsi="Calibri" w:eastAsia="Calibri"/>
+                <w:b/>
+                <w:i w:val="0"/>
+                <w:sz w:val="18"/>
+              </w:rPr>
+              <w:t>November 1</w:t>
+            </w:r>
+            <w:r>
+              <w:rPr>
+                <w:rFonts w:ascii="Calibri" w:hAnsi="Calibri" w:eastAsia="Calibri"/>
+                <w:b w:val="0"/>
+                <w:i w:val="0"/>
+                <w:sz w:val="18"/>
+              </w:rPr>
+            </w:r>
+          </w:p>
+        </w:tc>
+      </w:tr>
+      <w:tr>
+        <w:tc>
+          <w:tcPr>
+            <w:tcW w:type="dxa" w:w="4896"/>
+          </w:tcPr>
+          <w:p>
+            <w:r/>
+            <w:r>
+              <w:rPr>
+                <w:rFonts w:ascii="Calibri" w:hAnsi="Calibri" w:eastAsia="Calibri"/>
+                <w:b w:val="0"/>
+                <w:i w:val="0"/>
+                <w:sz w:val="18"/>
+              </w:rPr>
+              <w:t>Regular Decision (first-year)</w:t>
+            </w:r>
+          </w:p>
+        </w:tc>
+        <w:tc>
+          <w:tcPr>
+            <w:tcW w:type="dxa" w:w="4896"/>
+          </w:tcPr>
+          <w:p>
+            <w:r/>
+            <w:r>
+              <w:rPr>
+                <w:rFonts w:ascii="Calibri" w:hAnsi="Calibri" w:eastAsia="Calibri"/>
+                <w:b w:val="0"/>
+                <w:i w:val="0"/>
+                <w:sz w:val="18"/>
+              </w:rPr>
+            </w:r>
+            <w:r>
+              <w:rPr>
+                <w:rFonts w:ascii="Calibri" w:hAnsi="Calibri" w:eastAsia="Calibri"/>
+                <w:b/>
+                <w:i w:val="0"/>
+                <w:sz w:val="18"/>
+              </w:rPr>
+              <w:t>December 1</w:t>
+            </w:r>
+            <w:r>
+              <w:rPr>
+                <w:rFonts w:ascii="Calibri" w:hAnsi="Calibri" w:eastAsia="Calibri"/>
+                <w:b w:val="0"/>
+                <w:i w:val="0"/>
+                <w:sz w:val="18"/>
+              </w:rPr>
+            </w:r>
+          </w:p>
+        </w:tc>
+      </w:tr>
+    </w:tbl>
+    <w:p/>
+    <w:p>
+      <w:r>
+        <w:rPr>
+          <w:rFonts w:ascii="Calibri" w:hAnsi="Calibri" w:eastAsia="Calibri"/>
+          <w:b w:val="0"/>
+          <w:i w:val="0"/>
+          <w:sz w:val="22"/>
+        </w:rPr>
+      </w:r>
+      <w:r>
+        <w:rPr>
+          <w:rFonts w:ascii="Calibri" w:hAnsi="Calibri" w:eastAsia="Calibri"/>
+          <w:b/>
+          <w:i w:val="0"/>
+          <w:sz w:val="22"/>
+        </w:rPr>
+        <w:t>Writing:</w:t>
+      </w:r>
+      <w:r>
+        <w:rPr>
+          <w:rFonts w:ascii="Calibri" w:hAnsi="Calibri" w:eastAsia="Calibri"/>
+          <w:b w:val="0"/>
+          <w:i w:val="0"/>
+          <w:sz w:val="22"/>
+        </w:rPr>
+        <w:t xml:space="preserve"> Rutgers reviews an </w:t>
+      </w:r>
+      <w:r>
+        <w:rPr>
+          <w:rFonts w:ascii="Calibri" w:hAnsi="Calibri" w:eastAsia="Calibri"/>
+          <w:b/>
+          <w:i w:val="0"/>
+          <w:sz w:val="22"/>
+        </w:rPr>
+        <w:t>essay</w:t>
+      </w:r>
+      <w:r>
+        <w:rPr>
+          <w:rFonts w:ascii="Calibri" w:hAnsi="Calibri" w:eastAsia="Calibri"/>
+          <w:b w:val="0"/>
+          <w:i w:val="0"/>
+          <w:sz w:val="22"/>
+        </w:rPr>
+        <w:t xml:space="preserve"> as part of holistic review. On Common App, complete whatever Rutgers-specific writing questions appear (often the shared personal statement plus any Rutgers short responses).  </w:t>
+      </w:r>
+    </w:p>
+    <w:p>
+      <w:r>
+        <w:rPr>
+          <w:rFonts w:ascii="Calibri" w:hAnsi="Calibri" w:eastAsia="Calibri"/>
+          <w:b w:val="0"/>
+          <w:i w:val="0"/>
+          <w:sz w:val="22"/>
+        </w:rPr>
+      </w:r>
+      <w:r>
+        <w:rPr>
+          <w:rFonts w:ascii="Calibri" w:hAnsi="Calibri" w:eastAsia="Calibri"/>
+          <w:b/>
+          <w:i w:val="0"/>
+          <w:sz w:val="22"/>
+        </w:rPr>
+        <w:t>Confidence:</w:t>
+      </w:r>
+      <w:r>
+        <w:rPr>
+          <w:rFonts w:ascii="Calibri" w:hAnsi="Calibri" w:eastAsia="Calibri"/>
+          <w:b w:val="0"/>
+          <w:i w:val="0"/>
+          <w:sz w:val="22"/>
+        </w:rPr>
+        <w:t xml:space="preserve"> Official that an essay is reviewed; </w:t>
+      </w:r>
+      <w:r>
+        <w:rPr>
+          <w:rFonts w:ascii="Calibri" w:hAnsi="Calibri" w:eastAsia="Calibri"/>
+          <w:b/>
+          <w:i w:val="0"/>
+          <w:sz w:val="22"/>
+        </w:rPr>
+        <w:t>Needs Login Confirmation</w:t>
+      </w:r>
+      <w:r>
+        <w:rPr>
+          <w:rFonts w:ascii="Calibri" w:hAnsi="Calibri" w:eastAsia="Calibri"/>
+          <w:b w:val="0"/>
+          <w:i w:val="0"/>
+          <w:sz w:val="22"/>
+        </w:rPr>
+        <w:t xml:space="preserve"> for any Rutgers-only prompt text/limits.</w:t>
+      </w:r>
+    </w:p>
+    <w:p>
+      <w:r>
+        <w:rPr>
+          <w:rFonts w:ascii="Calibri" w:hAnsi="Calibri" w:eastAsia="Calibri"/>
+          <w:b w:val="0"/>
+          <w:i w:val="0"/>
+          <w:sz w:val="22"/>
+        </w:rPr>
+        <w:t>No separate long “Why Rutgers” supplement is commonly required beyond application questions — verify in portal.</w:t>
+      </w:r>
+    </w:p>
+    <w:p>
+      <w:r>
+        <w:rPr>
+          <w:rFonts w:ascii="Calibri" w:hAnsi="Calibri" w:eastAsia="Calibri"/>
+          <w:b w:val="0"/>
+          <w:i w:val="0"/>
+          <w:sz w:val="18"/>
+        </w:rPr>
+        <w:t>────────────────────────────────────────</w:t>
+      </w:r>
+    </w:p>
+    <w:p>
+      <w:pPr>
+        <w:pStyle w:val="Heading2"/>
+      </w:pPr>
+      <w:r>
+        <w:t>University of Rhode Island — RD</w:t>
+      </w:r>
+    </w:p>
+    <w:p>
+      <w:r>
+        <w:rPr>
+          <w:rFonts w:ascii="Calibri" w:hAnsi="Calibri" w:eastAsia="Calibri"/>
+          <w:b w:val="0"/>
+          <w:i w:val="0"/>
+          <w:sz w:val="22"/>
+        </w:rPr>
+      </w:r>
+      <w:r>
+        <w:rPr>
+          <w:rFonts w:ascii="Calibri" w:hAnsi="Calibri" w:eastAsia="Calibri"/>
+          <w:b/>
+          <w:i w:val="0"/>
+          <w:sz w:val="22"/>
+        </w:rPr>
+        <w:t>Plans &amp; deadlines (Official — uri.edu/admission/first-year):</w:t>
+      </w:r>
+      <w:r>
+        <w:rPr>
+          <w:rFonts w:ascii="Calibri" w:hAnsi="Calibri" w:eastAsia="Calibri"/>
+          <w:b w:val="0"/>
+          <w:i w:val="0"/>
+          <w:sz w:val="22"/>
+        </w:rPr>
+      </w:r>
+    </w:p>
+    <w:tbl>
+      <w:tblPr>
+        <w:tblStyle w:val="TableGrid"/>
+        <w:tblW w:type="auto" w:w="0"/>
+        <w:tblLook w:firstColumn="1" w:firstRow="1" w:lastColumn="0" w:lastRow="0" w:noHBand="0" w:noVBand="1" w:val="04A0"/>
+      </w:tblPr>
+      <w:tblGrid>
+        <w:gridCol w:w="2448"/>
+        <w:gridCol w:w="2448"/>
+        <w:gridCol w:w="2448"/>
+        <w:gridCol w:w="2448"/>
+      </w:tblGrid>
+      <w:tr>
+        <w:tc>
+          <w:tcPr>
+            <w:tcW w:type="dxa" w:w="2448"/>
+            <w:shd w:fill="1F4E79" w:val="clear"/>
+          </w:tcPr>
+          <w:p>
+            <w:r>
+              <w:rPr>
+                <w:b/>
+                <w:color w:val="FFFFFF"/>
+              </w:rPr>
+            </w:r>
+            <w:r>
+              <w:rPr>
+                <w:rFonts w:ascii="Calibri" w:hAnsi="Calibri" w:eastAsia="Calibri"/>
+                <w:b/>
+                <w:i w:val="0"/>
+                <w:color w:val="FFFFFF"/>
+                <w:sz w:val="18"/>
+              </w:rPr>
+              <w:t>Plan</w:t>
+            </w:r>
+          </w:p>
+        </w:tc>
+        <w:tc>
+          <w:tcPr>
+            <w:tcW w:type="dxa" w:w="2448"/>
+            <w:shd w:fill="1F4E79" w:val="clear"/>
+          </w:tcPr>
+          <w:p>
+            <w:r>
+              <w:rPr>
+                <w:b/>
+                <w:color w:val="FFFFFF"/>
+              </w:rPr>
+            </w:r>
+            <w:r>
+              <w:rPr>
+                <w:rFonts w:ascii="Calibri" w:hAnsi="Calibri" w:eastAsia="Calibri"/>
+                <w:b/>
+                <w:i w:val="0"/>
+                <w:color w:val="FFFFFF"/>
+                <w:sz w:val="18"/>
+              </w:rPr>
               <w:t>Application</w:t>
             </w:r>
           </w:p>
@@ -10848,7 +11138,7 @@
                 <w:i w:val="0"/>
                 <w:sz w:val="18"/>
               </w:rPr>
-              <w:t>URochester</w:t>
+              <w:t>University of Rochester</w:t>
             </w:r>
           </w:p>
         </w:tc>
@@ -13127,7 +13417,7 @@
     <w:qFormat/>
     <w:rsid w:val="00FC693F"/>
     <w:rPr>
-      <w:rFonts w:ascii="Calibri" w:hAnsi="Calibri" w:eastAsia="Calibri"/>
+      <w:rFonts w:ascii="Calibri" w:hAnsi="Calibri"/>
       <w:sz w:val="22"/>
     </w:rPr>
   </w:style>

</xml_diff>

<commit_message>
Add navigable TOC and suggested-school supplement notes
Close remaining Phase 3/4 acceptance gaps: table of contents for
the markdown/Word packet, and typical-supplement guidance on the
additional school suggestions. Point the plan matrix to SOURCES.md.

Co-authored-by: Junyi (Conny) Zhou <JunyiZhou-Conny@users.noreply.github.com>
</commit_message>
<xml_diff>
--- a/docs/supplemental-essays-and-plans-2026-27.docx
+++ b/docs/supplemental-essays-and-plans-2026-27.docx
@@ -696,6 +696,695 @@
           <w:sz w:val="22"/>
         </w:rPr>
         <w:t xml:space="preserve"> (not Common App)</w:t>
+      </w:r>
+    </w:p>
+    <w:p>
+      <w:pPr>
+        <w:pStyle w:val="Heading2"/>
+      </w:pPr>
+      <w:r>
+        <w:t>Table of contents</w:t>
+      </w:r>
+    </w:p>
+    <w:p>
+      <w:pPr>
+        <w:pStyle w:val="ListNumber"/>
+      </w:pPr>
+      <w:r>
+        <w:rPr>
+          <w:rFonts w:ascii="Calibri" w:hAnsi="Calibri" w:eastAsia="Calibri"/>
+          <w:b w:val="0"/>
+          <w:i w:val="0"/>
+          <w:sz w:val="22"/>
+        </w:rPr>
+      </w:r>
+      <w:r>
+        <w:rPr>
+          <w:rFonts w:ascii="Calibri" w:hAnsi="Calibri" w:eastAsia="Calibri"/>
+          <w:b w:val="0"/>
+          <w:i w:val="0"/>
+          <w:sz w:val="22"/>
+          <w:u w:val="single"/>
+        </w:rPr>
+        <w:t>Application plan snapshot</w:t>
+      </w:r>
+      <w:r>
+        <w:rPr>
+          <w:rFonts w:ascii="Calibri" w:hAnsi="Calibri" w:eastAsia="Calibri"/>
+          <w:b w:val="0"/>
+          <w:i w:val="0"/>
+          <w:sz w:val="22"/>
+        </w:rPr>
+      </w:r>
+    </w:p>
+    <w:p>
+      <w:pPr>
+        <w:pStyle w:val="ListNumber"/>
+      </w:pPr>
+      <w:r>
+        <w:rPr>
+          <w:rFonts w:ascii="Calibri" w:hAnsi="Calibri" w:eastAsia="Calibri"/>
+          <w:b w:val="0"/>
+          <w:i w:val="0"/>
+          <w:sz w:val="22"/>
+        </w:rPr>
+      </w:r>
+      <w:r>
+        <w:rPr>
+          <w:rFonts w:ascii="Calibri" w:hAnsi="Calibri" w:eastAsia="Calibri"/>
+          <w:b w:val="0"/>
+          <w:i w:val="0"/>
+          <w:sz w:val="22"/>
+          <w:u w:val="single"/>
+        </w:rPr>
+        <w:t>Common App personal statement</w:t>
+      </w:r>
+      <w:r>
+        <w:rPr>
+          <w:rFonts w:ascii="Calibri" w:hAnsi="Calibri" w:eastAsia="Calibri"/>
+          <w:b w:val="0"/>
+          <w:i w:val="0"/>
+          <w:sz w:val="22"/>
+        </w:rPr>
+      </w:r>
+    </w:p>
+    <w:p>
+      <w:pPr>
+        <w:pStyle w:val="ListNumber"/>
+      </w:pPr>
+      <w:r>
+        <w:rPr>
+          <w:rFonts w:ascii="Calibri" w:hAnsi="Calibri" w:eastAsia="Calibri"/>
+          <w:b w:val="0"/>
+          <w:i w:val="0"/>
+          <w:sz w:val="22"/>
+        </w:rPr>
+      </w:r>
+      <w:r>
+        <w:rPr>
+          <w:rFonts w:ascii="Calibri" w:hAnsi="Calibri" w:eastAsia="Calibri"/>
+          <w:b w:val="0"/>
+          <w:i w:val="0"/>
+          <w:sz w:val="22"/>
+          <w:u w:val="single"/>
+        </w:rPr>
+        <w:t>School-by-school supplements &amp; notes</w:t>
+      </w:r>
+      <w:r>
+        <w:rPr>
+          <w:rFonts w:ascii="Calibri" w:hAnsi="Calibri" w:eastAsia="Calibri"/>
+          <w:b w:val="0"/>
+          <w:i w:val="0"/>
+          <w:sz w:val="22"/>
+        </w:rPr>
+      </w:r>
+    </w:p>
+    <w:p>
+      <w:r>
+        <w:rPr>
+          <w:rFonts w:ascii="Calibri" w:hAnsi="Calibri" w:eastAsia="Calibri"/>
+          <w:b w:val="0"/>
+          <w:i w:val="0"/>
+          <w:sz w:val="22"/>
+        </w:rPr>
+        <w:t xml:space="preserve">   - </w:t>
+      </w:r>
+      <w:r>
+        <w:rPr>
+          <w:rFonts w:ascii="Calibri" w:hAnsi="Calibri" w:eastAsia="Calibri"/>
+          <w:b w:val="0"/>
+          <w:i w:val="0"/>
+          <w:sz w:val="22"/>
+          <w:u w:val="single"/>
+        </w:rPr>
+        <w:t>Boston University</w:t>
+      </w:r>
+      <w:r>
+        <w:rPr>
+          <w:rFonts w:ascii="Calibri" w:hAnsi="Calibri" w:eastAsia="Calibri"/>
+          <w:b w:val="0"/>
+          <w:i w:val="0"/>
+          <w:sz w:val="22"/>
+        </w:rPr>
+      </w:r>
+    </w:p>
+    <w:p>
+      <w:r>
+        <w:rPr>
+          <w:rFonts w:ascii="Calibri" w:hAnsi="Calibri" w:eastAsia="Calibri"/>
+          <w:b w:val="0"/>
+          <w:i w:val="0"/>
+          <w:sz w:val="22"/>
+        </w:rPr>
+        <w:t xml:space="preserve">   - </w:t>
+      </w:r>
+      <w:r>
+        <w:rPr>
+          <w:rFonts w:ascii="Calibri" w:hAnsi="Calibri" w:eastAsia="Calibri"/>
+          <w:b w:val="0"/>
+          <w:i w:val="0"/>
+          <w:sz w:val="22"/>
+          <w:u w:val="single"/>
+        </w:rPr>
+        <w:t>UMass Amherst</w:t>
+      </w:r>
+      <w:r>
+        <w:rPr>
+          <w:rFonts w:ascii="Calibri" w:hAnsi="Calibri" w:eastAsia="Calibri"/>
+          <w:b w:val="0"/>
+          <w:i w:val="0"/>
+          <w:sz w:val="22"/>
+        </w:rPr>
+      </w:r>
+    </w:p>
+    <w:p>
+      <w:r>
+        <w:rPr>
+          <w:rFonts w:ascii="Calibri" w:hAnsi="Calibri" w:eastAsia="Calibri"/>
+          <w:b w:val="0"/>
+          <w:i w:val="0"/>
+          <w:sz w:val="22"/>
+        </w:rPr>
+        <w:t xml:space="preserve">   - </w:t>
+      </w:r>
+      <w:r>
+        <w:rPr>
+          <w:rFonts w:ascii="Calibri" w:hAnsi="Calibri" w:eastAsia="Calibri"/>
+          <w:b w:val="0"/>
+          <w:i w:val="0"/>
+          <w:sz w:val="22"/>
+          <w:u w:val="single"/>
+        </w:rPr>
+        <w:t>NYU</w:t>
+      </w:r>
+      <w:r>
+        <w:rPr>
+          <w:rFonts w:ascii="Calibri" w:hAnsi="Calibri" w:eastAsia="Calibri"/>
+          <w:b w:val="0"/>
+          <w:i w:val="0"/>
+          <w:sz w:val="22"/>
+        </w:rPr>
+      </w:r>
+    </w:p>
+    <w:p>
+      <w:r>
+        <w:rPr>
+          <w:rFonts w:ascii="Calibri" w:hAnsi="Calibri" w:eastAsia="Calibri"/>
+          <w:b w:val="0"/>
+          <w:i w:val="0"/>
+          <w:sz w:val="22"/>
+        </w:rPr>
+        <w:t xml:space="preserve">   - </w:t>
+      </w:r>
+      <w:r>
+        <w:rPr>
+          <w:rFonts w:ascii="Calibri" w:hAnsi="Calibri" w:eastAsia="Calibri"/>
+          <w:b w:val="0"/>
+          <w:i w:val="0"/>
+          <w:sz w:val="22"/>
+          <w:u w:val="single"/>
+        </w:rPr>
+        <w:t>Northeastern</w:t>
+      </w:r>
+      <w:r>
+        <w:rPr>
+          <w:rFonts w:ascii="Calibri" w:hAnsi="Calibri" w:eastAsia="Calibri"/>
+          <w:b w:val="0"/>
+          <w:i w:val="0"/>
+          <w:sz w:val="22"/>
+        </w:rPr>
+      </w:r>
+    </w:p>
+    <w:p>
+      <w:r>
+        <w:rPr>
+          <w:rFonts w:ascii="Calibri" w:hAnsi="Calibri" w:eastAsia="Calibri"/>
+          <w:b w:val="0"/>
+          <w:i w:val="0"/>
+          <w:sz w:val="22"/>
+        </w:rPr>
+        <w:t xml:space="preserve">   - </w:t>
+      </w:r>
+      <w:r>
+        <w:rPr>
+          <w:rFonts w:ascii="Calibri" w:hAnsi="Calibri" w:eastAsia="Calibri"/>
+          <w:b w:val="0"/>
+          <w:i w:val="0"/>
+          <w:sz w:val="22"/>
+          <w:u w:val="single"/>
+        </w:rPr>
+        <w:t>Tufts</w:t>
+      </w:r>
+      <w:r>
+        <w:rPr>
+          <w:rFonts w:ascii="Calibri" w:hAnsi="Calibri" w:eastAsia="Calibri"/>
+          <w:b w:val="0"/>
+          <w:i w:val="0"/>
+          <w:sz w:val="22"/>
+        </w:rPr>
+      </w:r>
+    </w:p>
+    <w:p>
+      <w:r>
+        <w:rPr>
+          <w:rFonts w:ascii="Calibri" w:hAnsi="Calibri" w:eastAsia="Calibri"/>
+          <w:b w:val="0"/>
+          <w:i w:val="0"/>
+          <w:sz w:val="22"/>
+        </w:rPr>
+        <w:t xml:space="preserve">   - </w:t>
+      </w:r>
+      <w:r>
+        <w:rPr>
+          <w:rFonts w:ascii="Calibri" w:hAnsi="Calibri" w:eastAsia="Calibri"/>
+          <w:b w:val="0"/>
+          <w:i w:val="0"/>
+          <w:sz w:val="22"/>
+          <w:u w:val="single"/>
+        </w:rPr>
+        <w:t>Brandeis</w:t>
+      </w:r>
+      <w:r>
+        <w:rPr>
+          <w:rFonts w:ascii="Calibri" w:hAnsi="Calibri" w:eastAsia="Calibri"/>
+          <w:b w:val="0"/>
+          <w:i w:val="0"/>
+          <w:sz w:val="22"/>
+        </w:rPr>
+      </w:r>
+    </w:p>
+    <w:p>
+      <w:r>
+        <w:rPr>
+          <w:rFonts w:ascii="Calibri" w:hAnsi="Calibri" w:eastAsia="Calibri"/>
+          <w:b w:val="0"/>
+          <w:i w:val="0"/>
+          <w:sz w:val="22"/>
+        </w:rPr>
+        <w:t xml:space="preserve">   - </w:t>
+      </w:r>
+      <w:r>
+        <w:rPr>
+          <w:rFonts w:ascii="Calibri" w:hAnsi="Calibri" w:eastAsia="Calibri"/>
+          <w:b w:val="0"/>
+          <w:i w:val="0"/>
+          <w:sz w:val="22"/>
+          <w:u w:val="single"/>
+        </w:rPr>
+        <w:t>Boston College</w:t>
+      </w:r>
+      <w:r>
+        <w:rPr>
+          <w:rFonts w:ascii="Calibri" w:hAnsi="Calibri" w:eastAsia="Calibri"/>
+          <w:b w:val="0"/>
+          <w:i w:val="0"/>
+          <w:sz w:val="22"/>
+        </w:rPr>
+      </w:r>
+    </w:p>
+    <w:p>
+      <w:r>
+        <w:rPr>
+          <w:rFonts w:ascii="Calibri" w:hAnsi="Calibri" w:eastAsia="Calibri"/>
+          <w:b w:val="0"/>
+          <w:i w:val="0"/>
+          <w:sz w:val="22"/>
+        </w:rPr>
+        <w:t xml:space="preserve">   - </w:t>
+      </w:r>
+      <w:r>
+        <w:rPr>
+          <w:rFonts w:ascii="Calibri" w:hAnsi="Calibri" w:eastAsia="Calibri"/>
+          <w:b w:val="0"/>
+          <w:i w:val="0"/>
+          <w:sz w:val="22"/>
+          <w:u w:val="single"/>
+        </w:rPr>
+        <w:t>Penn State</w:t>
+      </w:r>
+      <w:r>
+        <w:rPr>
+          <w:rFonts w:ascii="Calibri" w:hAnsi="Calibri" w:eastAsia="Calibri"/>
+          <w:b w:val="0"/>
+          <w:i w:val="0"/>
+          <w:sz w:val="22"/>
+        </w:rPr>
+      </w:r>
+    </w:p>
+    <w:p>
+      <w:r>
+        <w:rPr>
+          <w:rFonts w:ascii="Calibri" w:hAnsi="Calibri" w:eastAsia="Calibri"/>
+          <w:b w:val="0"/>
+          <w:i w:val="0"/>
+          <w:sz w:val="22"/>
+        </w:rPr>
+        <w:t xml:space="preserve">   - </w:t>
+      </w:r>
+      <w:r>
+        <w:rPr>
+          <w:rFonts w:ascii="Calibri" w:hAnsi="Calibri" w:eastAsia="Calibri"/>
+          <w:b w:val="0"/>
+          <w:i w:val="0"/>
+          <w:sz w:val="22"/>
+          <w:u w:val="single"/>
+        </w:rPr>
+        <w:t>University of Rochester</w:t>
+      </w:r>
+      <w:r>
+        <w:rPr>
+          <w:rFonts w:ascii="Calibri" w:hAnsi="Calibri" w:eastAsia="Calibri"/>
+          <w:b w:val="0"/>
+          <w:i w:val="0"/>
+          <w:sz w:val="22"/>
+        </w:rPr>
+      </w:r>
+    </w:p>
+    <w:p>
+      <w:r>
+        <w:rPr>
+          <w:rFonts w:ascii="Calibri" w:hAnsi="Calibri" w:eastAsia="Calibri"/>
+          <w:b w:val="0"/>
+          <w:i w:val="0"/>
+          <w:sz w:val="22"/>
+        </w:rPr>
+        <w:t xml:space="preserve">   - </w:t>
+      </w:r>
+      <w:r>
+        <w:rPr>
+          <w:rFonts w:ascii="Calibri" w:hAnsi="Calibri" w:eastAsia="Calibri"/>
+          <w:b w:val="0"/>
+          <w:i w:val="0"/>
+          <w:sz w:val="22"/>
+          <w:u w:val="single"/>
+        </w:rPr>
+        <w:t>Syracuse</w:t>
+      </w:r>
+      <w:r>
+        <w:rPr>
+          <w:rFonts w:ascii="Calibri" w:hAnsi="Calibri" w:eastAsia="Calibri"/>
+          <w:b w:val="0"/>
+          <w:i w:val="0"/>
+          <w:sz w:val="22"/>
+        </w:rPr>
+      </w:r>
+    </w:p>
+    <w:p>
+      <w:r>
+        <w:rPr>
+          <w:rFonts w:ascii="Calibri" w:hAnsi="Calibri" w:eastAsia="Calibri"/>
+          <w:b w:val="0"/>
+          <w:i w:val="0"/>
+          <w:sz w:val="22"/>
+        </w:rPr>
+        <w:t xml:space="preserve">   - </w:t>
+      </w:r>
+      <w:r>
+        <w:rPr>
+          <w:rFonts w:ascii="Calibri" w:hAnsi="Calibri" w:eastAsia="Calibri"/>
+          <w:b w:val="0"/>
+          <w:i w:val="0"/>
+          <w:sz w:val="22"/>
+          <w:u w:val="single"/>
+        </w:rPr>
+        <w:t>Rutgers–New Brunswick</w:t>
+      </w:r>
+      <w:r>
+        <w:rPr>
+          <w:rFonts w:ascii="Calibri" w:hAnsi="Calibri" w:eastAsia="Calibri"/>
+          <w:b w:val="0"/>
+          <w:i w:val="0"/>
+          <w:sz w:val="22"/>
+        </w:rPr>
+      </w:r>
+    </w:p>
+    <w:p>
+      <w:r>
+        <w:rPr>
+          <w:rFonts w:ascii="Calibri" w:hAnsi="Calibri" w:eastAsia="Calibri"/>
+          <w:b w:val="0"/>
+          <w:i w:val="0"/>
+          <w:sz w:val="22"/>
+        </w:rPr>
+        <w:t xml:space="preserve">   - </w:t>
+      </w:r>
+      <w:r>
+        <w:rPr>
+          <w:rFonts w:ascii="Calibri" w:hAnsi="Calibri" w:eastAsia="Calibri"/>
+          <w:b w:val="0"/>
+          <w:i w:val="0"/>
+          <w:sz w:val="22"/>
+          <w:u w:val="single"/>
+        </w:rPr>
+        <w:t>URI</w:t>
+      </w:r>
+      <w:r>
+        <w:rPr>
+          <w:rFonts w:ascii="Calibri" w:hAnsi="Calibri" w:eastAsia="Calibri"/>
+          <w:b w:val="0"/>
+          <w:i w:val="0"/>
+          <w:sz w:val="22"/>
+        </w:rPr>
+      </w:r>
+    </w:p>
+    <w:p>
+      <w:r>
+        <w:rPr>
+          <w:rFonts w:ascii="Calibri" w:hAnsi="Calibri" w:eastAsia="Calibri"/>
+          <w:b w:val="0"/>
+          <w:i w:val="0"/>
+          <w:sz w:val="22"/>
+        </w:rPr>
+        <w:t xml:space="preserve">   - </w:t>
+      </w:r>
+      <w:r>
+        <w:rPr>
+          <w:rFonts w:ascii="Calibri" w:hAnsi="Calibri" w:eastAsia="Calibri"/>
+          <w:b w:val="0"/>
+          <w:i w:val="0"/>
+          <w:sz w:val="22"/>
+          <w:u w:val="single"/>
+        </w:rPr>
+        <w:t>Suffolk</w:t>
+      </w:r>
+      <w:r>
+        <w:rPr>
+          <w:rFonts w:ascii="Calibri" w:hAnsi="Calibri" w:eastAsia="Calibri"/>
+          <w:b w:val="0"/>
+          <w:i w:val="0"/>
+          <w:sz w:val="22"/>
+        </w:rPr>
+      </w:r>
+    </w:p>
+    <w:p>
+      <w:r>
+        <w:rPr>
+          <w:rFonts w:ascii="Calibri" w:hAnsi="Calibri" w:eastAsia="Calibri"/>
+          <w:b w:val="0"/>
+          <w:i w:val="0"/>
+          <w:sz w:val="22"/>
+        </w:rPr>
+        <w:t xml:space="preserve">   - </w:t>
+      </w:r>
+      <w:r>
+        <w:rPr>
+          <w:rFonts w:ascii="Calibri" w:hAnsi="Calibri" w:eastAsia="Calibri"/>
+          <w:b w:val="0"/>
+          <w:i w:val="0"/>
+          <w:sz w:val="22"/>
+          <w:u w:val="single"/>
+        </w:rPr>
+        <w:t>UC Berkeley</w:t>
+      </w:r>
+      <w:r>
+        <w:rPr>
+          <w:rFonts w:ascii="Calibri" w:hAnsi="Calibri" w:eastAsia="Calibri"/>
+          <w:b w:val="0"/>
+          <w:i w:val="0"/>
+          <w:sz w:val="22"/>
+        </w:rPr>
+      </w:r>
+    </w:p>
+    <w:p>
+      <w:r>
+        <w:rPr>
+          <w:rFonts w:ascii="Calibri" w:hAnsi="Calibri" w:eastAsia="Calibri"/>
+          <w:b w:val="0"/>
+          <w:i w:val="0"/>
+          <w:sz w:val="22"/>
+        </w:rPr>
+        <w:t xml:space="preserve">   - </w:t>
+      </w:r>
+      <w:r>
+        <w:rPr>
+          <w:rFonts w:ascii="Calibri" w:hAnsi="Calibri" w:eastAsia="Calibri"/>
+          <w:b w:val="0"/>
+          <w:i w:val="0"/>
+          <w:sz w:val="22"/>
+          <w:u w:val="single"/>
+        </w:rPr>
+        <w:t>SUNY placeholder</w:t>
+      </w:r>
+      <w:r>
+        <w:rPr>
+          <w:rFonts w:ascii="Calibri" w:hAnsi="Calibri" w:eastAsia="Calibri"/>
+          <w:b w:val="0"/>
+          <w:i w:val="0"/>
+          <w:sz w:val="22"/>
+        </w:rPr>
+      </w:r>
+    </w:p>
+    <w:p>
+      <w:pPr>
+        <w:pStyle w:val="ListNumber"/>
+      </w:pPr>
+      <w:r>
+        <w:rPr>
+          <w:rFonts w:ascii="Calibri" w:hAnsi="Calibri" w:eastAsia="Calibri"/>
+          <w:b w:val="0"/>
+          <w:i w:val="0"/>
+          <w:sz w:val="22"/>
+        </w:rPr>
+      </w:r>
+      <w:r>
+        <w:rPr>
+          <w:rFonts w:ascii="Calibri" w:hAnsi="Calibri" w:eastAsia="Calibri"/>
+          <w:b w:val="0"/>
+          <w:i w:val="0"/>
+          <w:sz w:val="22"/>
+          <w:u w:val="single"/>
+        </w:rPr>
+        <w:t>Essay workload quick map</w:t>
+      </w:r>
+      <w:r>
+        <w:rPr>
+          <w:rFonts w:ascii="Calibri" w:hAnsi="Calibri" w:eastAsia="Calibri"/>
+          <w:b w:val="0"/>
+          <w:i w:val="0"/>
+          <w:sz w:val="22"/>
+        </w:rPr>
+      </w:r>
+    </w:p>
+    <w:p>
+      <w:pPr>
+        <w:pStyle w:val="ListNumber"/>
+      </w:pPr>
+      <w:r>
+        <w:rPr>
+          <w:rFonts w:ascii="Calibri" w:hAnsi="Calibri" w:eastAsia="Calibri"/>
+          <w:b w:val="0"/>
+          <w:i w:val="0"/>
+          <w:sz w:val="22"/>
+        </w:rPr>
+      </w:r>
+      <w:r>
+        <w:rPr>
+          <w:rFonts w:ascii="Calibri" w:hAnsi="Calibri" w:eastAsia="Calibri"/>
+          <w:b w:val="0"/>
+          <w:i w:val="0"/>
+          <w:sz w:val="22"/>
+          <w:u w:val="single"/>
+        </w:rPr>
+        <w:t>Suggested additional schools</w:t>
+      </w:r>
+      <w:r>
+        <w:rPr>
+          <w:rFonts w:ascii="Calibri" w:hAnsi="Calibri" w:eastAsia="Calibri"/>
+          <w:b w:val="0"/>
+          <w:i w:val="0"/>
+          <w:sz w:val="22"/>
+        </w:rPr>
+      </w:r>
+    </w:p>
+    <w:p>
+      <w:pPr>
+        <w:pStyle w:val="ListNumber"/>
+      </w:pPr>
+      <w:r>
+        <w:rPr>
+          <w:rFonts w:ascii="Calibri" w:hAnsi="Calibri" w:eastAsia="Calibri"/>
+          <w:b w:val="0"/>
+          <w:i w:val="0"/>
+          <w:sz w:val="22"/>
+        </w:rPr>
+      </w:r>
+      <w:r>
+        <w:rPr>
+          <w:rFonts w:ascii="Calibri" w:hAnsi="Calibri" w:eastAsia="Calibri"/>
+          <w:b w:val="0"/>
+          <w:i w:val="0"/>
+          <w:sz w:val="22"/>
+          <w:u w:val="single"/>
+        </w:rPr>
+        <w:t>Common App confirm checklist</w:t>
+      </w:r>
+      <w:r>
+        <w:rPr>
+          <w:rFonts w:ascii="Calibri" w:hAnsi="Calibri" w:eastAsia="Calibri"/>
+          <w:b w:val="0"/>
+          <w:i w:val="0"/>
+          <w:sz w:val="22"/>
+        </w:rPr>
+      </w:r>
+    </w:p>
+    <w:p>
+      <w:pPr>
+        <w:pStyle w:val="ListNumber"/>
+      </w:pPr>
+      <w:r>
+        <w:rPr>
+          <w:rFonts w:ascii="Calibri" w:hAnsi="Calibri" w:eastAsia="Calibri"/>
+          <w:b w:val="0"/>
+          <w:i w:val="0"/>
+          <w:sz w:val="22"/>
+        </w:rPr>
+      </w:r>
+      <w:r>
+        <w:rPr>
+          <w:rFonts w:ascii="Calibri" w:hAnsi="Calibri" w:eastAsia="Calibri"/>
+          <w:b w:val="0"/>
+          <w:i w:val="0"/>
+          <w:sz w:val="22"/>
+          <w:u w:val="single"/>
+        </w:rPr>
+        <w:t>Open questions</w:t>
+      </w:r>
+      <w:r>
+        <w:rPr>
+          <w:rFonts w:ascii="Calibri" w:hAnsi="Calibri" w:eastAsia="Calibri"/>
+          <w:b w:val="0"/>
+          <w:i w:val="0"/>
+          <w:sz w:val="22"/>
+        </w:rPr>
+      </w:r>
+    </w:p>
+    <w:p>
+      <w:r>
+        <w:rPr>
+          <w:rFonts w:ascii="Calibri" w:hAnsi="Calibri" w:eastAsia="Calibri"/>
+          <w:b w:val="0"/>
+          <w:i w:val="0"/>
+          <w:sz w:val="22"/>
+        </w:rPr>
+        <w:t xml:space="preserve">Source audit trail: </w:t>
+      </w:r>
+      <w:r>
+        <w:rPr>
+          <w:rFonts w:ascii="Calibri" w:hAnsi="Calibri" w:eastAsia="Calibri"/>
+          <w:b w:val="0"/>
+          <w:i w:val="0"/>
+          <w:sz w:val="22"/>
+          <w:u w:val="single"/>
+        </w:rPr>
+        <w:t>`SOURCES.md`</w:t>
+      </w:r>
+      <w:r>
+        <w:rPr>
+          <w:rFonts w:ascii="Calibri" w:hAnsi="Calibri" w:eastAsia="Calibri"/>
+          <w:b w:val="0"/>
+          <w:i w:val="0"/>
+          <w:sz w:val="22"/>
+        </w:rPr>
       </w:r>
     </w:p>
     <w:p>
@@ -2843,6 +3532,53 @@
           <w:i w:val="0"/>
           <w:sz w:val="22"/>
         </w:rPr>
+        <w:t>Sources for this matrix:</w:t>
+      </w:r>
+      <w:r>
+        <w:rPr>
+          <w:rFonts w:ascii="Calibri" w:hAnsi="Calibri" w:eastAsia="Calibri"/>
+          <w:b w:val="0"/>
+          <w:i w:val="0"/>
+          <w:sz w:val="22"/>
+        </w:rPr>
+        <w:t xml:space="preserve"> each school section below cites the deadline page used; full URL audit is in </w:t>
+      </w:r>
+      <w:r>
+        <w:rPr>
+          <w:rFonts w:ascii="Calibri" w:hAnsi="Calibri" w:eastAsia="Calibri"/>
+          <w:b w:val="0"/>
+          <w:i w:val="0"/>
+          <w:sz w:val="22"/>
+          <w:u w:val="single"/>
+        </w:rPr>
+        <w:t>`SOURCES.md`</w:t>
+      </w:r>
+      <w:r>
+        <w:rPr>
+          <w:rFonts w:ascii="Calibri" w:hAnsi="Calibri" w:eastAsia="Calibri"/>
+          <w:b w:val="0"/>
+          <w:i w:val="0"/>
+          <w:sz w:val="22"/>
+        </w:rPr>
+        <w:t xml:space="preserve"> (verified 2026-08-19). Binding vs non-binding is noted in the Decision/notes column and school sections.</w:t>
+      </w:r>
+    </w:p>
+    <w:p>
+      <w:r>
+        <w:rPr>
+          <w:rFonts w:ascii="Calibri" w:hAnsi="Calibri" w:eastAsia="Calibri"/>
+          <w:b w:val="0"/>
+          <w:i w:val="0"/>
+          <w:sz w:val="22"/>
+        </w:rPr>
+      </w:r>
+      <w:r>
+        <w:rPr>
+          <w:rFonts w:ascii="Calibri" w:hAnsi="Calibri" w:eastAsia="Calibri"/>
+          <w:b/>
+          <w:i w:val="0"/>
+          <w:sz w:val="22"/>
+        </w:rPr>
         <w:t>Empty ED2 slot — recommendation:</w:t>
       </w:r>
       <w:r>
@@ -11405,15 +12141,16 @@
         <w:tblLook w:firstColumn="1" w:firstRow="1" w:lastColumn="0" w:lastRow="0" w:noHBand="0" w:noVBand="1" w:val="04A0"/>
       </w:tblPr>
       <w:tblGrid>
-        <w:gridCol w:w="2448"/>
-        <w:gridCol w:w="2448"/>
-        <w:gridCol w:w="2448"/>
-        <w:gridCol w:w="2448"/>
+        <w:gridCol w:w="1958"/>
+        <w:gridCol w:w="1958"/>
+        <w:gridCol w:w="1958"/>
+        <w:gridCol w:w="1958"/>
+        <w:gridCol w:w="1958"/>
       </w:tblGrid>
       <w:tr>
         <w:tc>
           <w:tcPr>
-            <w:tcW w:type="dxa" w:w="2448"/>
+            <w:tcW w:type="dxa" w:w="1958"/>
             <w:shd w:fill="1F4E79" w:val="clear"/>
           </w:tcPr>
           <w:p>
@@ -11437,7 +12174,7 @@
         </w:tc>
         <w:tc>
           <w:tcPr>
-            <w:tcW w:type="dxa" w:w="2448"/>
+            <w:tcW w:type="dxa" w:w="1958"/>
             <w:shd w:fill="1F4E79" w:val="clear"/>
           </w:tcPr>
           <w:p>
@@ -11461,7 +12198,7 @@
         </w:tc>
         <w:tc>
           <w:tcPr>
-            <w:tcW w:type="dxa" w:w="2448"/>
+            <w:tcW w:type="dxa" w:w="1958"/>
             <w:shd w:fill="1F4E79" w:val="clear"/>
           </w:tcPr>
           <w:p>
@@ -11485,7 +12222,7 @@
         </w:tc>
         <w:tc>
           <w:tcPr>
-            <w:tcW w:type="dxa" w:w="2448"/>
+            <w:tcW w:type="dxa" w:w="1958"/>
             <w:shd w:fill="1F4E79" w:val="clear"/>
           </w:tcPr>
           <w:p>
@@ -11507,11 +12244,35 @@
             </w:r>
           </w:p>
         </w:tc>
+        <w:tc>
+          <w:tcPr>
+            <w:tcW w:type="dxa" w:w="1958"/>
+            <w:shd w:fill="1F4E79" w:val="clear"/>
+          </w:tcPr>
+          <w:p>
+            <w:r>
+              <w:rPr>
+                <w:b/>
+                <w:color w:val="FFFFFF"/>
+              </w:rPr>
+            </w:r>
+            <w:r>
+              <w:rPr>
+                <w:rFonts w:ascii="Calibri" w:hAnsi="Calibri" w:eastAsia="Calibri"/>
+                <w:b/>
+                <w:i w:val="0"/>
+                <w:color w:val="FFFFFF"/>
+                <w:sz w:val="18"/>
+              </w:rPr>
+              <w:t>Supplement (typical)</w:t>
+            </w:r>
+          </w:p>
+        </w:tc>
       </w:tr>
       <w:tr>
         <w:tc>
           <w:tcPr>
-            <w:tcW w:type="dxa" w:w="2448"/>
+            <w:tcW w:type="dxa" w:w="1958"/>
           </w:tcPr>
           <w:p>
             <w:r/>
@@ -11528,7 +12289,7 @@
         </w:tc>
         <w:tc>
           <w:tcPr>
-            <w:tcW w:type="dxa" w:w="2448"/>
+            <w:tcW w:type="dxa" w:w="1958"/>
           </w:tcPr>
           <w:p>
             <w:r/>
@@ -11545,7 +12306,7 @@
         </w:tc>
         <w:tc>
           <w:tcPr>
-            <w:tcW w:type="dxa" w:w="2448"/>
+            <w:tcW w:type="dxa" w:w="1958"/>
           </w:tcPr>
           <w:p>
             <w:r/>
@@ -11562,7 +12323,7 @@
         </w:tc>
         <w:tc>
           <w:tcPr>
-            <w:tcW w:type="dxa" w:w="2448"/>
+            <w:tcW w:type="dxa" w:w="1958"/>
           </w:tcPr>
           <w:p>
             <w:r/>
@@ -11574,6 +12335,23 @@
                 <w:sz w:val="18"/>
               </w:rPr>
               <w:t>Yes</w:t>
+            </w:r>
+          </w:p>
+        </w:tc>
+        <w:tc>
+          <w:tcPr>
+            <w:tcW w:type="dxa" w:w="1958"/>
+          </w:tcPr>
+          <w:p>
+            <w:r/>
+            <w:r>
+              <w:rPr>
+                <w:rFonts w:ascii="Calibri" w:hAnsi="Calibri" w:eastAsia="Calibri"/>
+                <w:b w:val="0"/>
+                <w:i w:val="0"/>
+                <w:sz w:val="18"/>
+              </w:rPr>
+              <w:t>Short / light — confirm in portal</w:t>
             </w:r>
           </w:p>
         </w:tc>
@@ -11581,7 +12359,7 @@
       <w:tr>
         <w:tc>
           <w:tcPr>
-            <w:tcW w:type="dxa" w:w="2448"/>
+            <w:tcW w:type="dxa" w:w="1958"/>
           </w:tcPr>
           <w:p>
             <w:r/>
@@ -11598,7 +12376,7 @@
         </w:tc>
         <w:tc>
           <w:tcPr>
-            <w:tcW w:type="dxa" w:w="2448"/>
+            <w:tcW w:type="dxa" w:w="1958"/>
           </w:tcPr>
           <w:p>
             <w:r/>
@@ -11615,7 +12393,7 @@
         </w:tc>
         <w:tc>
           <w:tcPr>
-            <w:tcW w:type="dxa" w:w="2448"/>
+            <w:tcW w:type="dxa" w:w="1958"/>
           </w:tcPr>
           <w:p>
             <w:r/>
@@ -11632,7 +12410,7 @@
         </w:tc>
         <w:tc>
           <w:tcPr>
-            <w:tcW w:type="dxa" w:w="2448"/>
+            <w:tcW w:type="dxa" w:w="1958"/>
           </w:tcPr>
           <w:p>
             <w:r/>
@@ -11644,6 +12422,23 @@
                 <w:sz w:val="18"/>
               </w:rPr>
               <w:t>Yes</w:t>
+            </w:r>
+          </w:p>
+        </w:tc>
+        <w:tc>
+          <w:tcPr>
+            <w:tcW w:type="dxa" w:w="1958"/>
+          </w:tcPr>
+          <w:p>
+            <w:r/>
+            <w:r>
+              <w:rPr>
+                <w:rFonts w:ascii="Calibri" w:hAnsi="Calibri" w:eastAsia="Calibri"/>
+                <w:b w:val="0"/>
+                <w:i w:val="0"/>
+                <w:sz w:val="18"/>
+              </w:rPr>
+              <w:t>Usually light — confirm</w:t>
             </w:r>
           </w:p>
         </w:tc>
@@ -11651,7 +12446,7 @@
       <w:tr>
         <w:tc>
           <w:tcPr>
-            <w:tcW w:type="dxa" w:w="2448"/>
+            <w:tcW w:type="dxa" w:w="1958"/>
           </w:tcPr>
           <w:p>
             <w:r/>
@@ -11668,7 +12463,7 @@
         </w:tc>
         <w:tc>
           <w:tcPr>
-            <w:tcW w:type="dxa" w:w="2448"/>
+            <w:tcW w:type="dxa" w:w="1958"/>
           </w:tcPr>
           <w:p>
             <w:r/>
@@ -11685,7 +12480,7 @@
         </w:tc>
         <w:tc>
           <w:tcPr>
-            <w:tcW w:type="dxa" w:w="2448"/>
+            <w:tcW w:type="dxa" w:w="1958"/>
           </w:tcPr>
           <w:p>
             <w:r/>
@@ -11702,7 +12497,7 @@
         </w:tc>
         <w:tc>
           <w:tcPr>
-            <w:tcW w:type="dxa" w:w="2448"/>
+            <w:tcW w:type="dxa" w:w="1958"/>
           </w:tcPr>
           <w:p>
             <w:r/>
@@ -11714,6 +12509,23 @@
                 <w:sz w:val="18"/>
               </w:rPr>
               <w:t>Yes</w:t>
+            </w:r>
+          </w:p>
+        </w:tc>
+        <w:tc>
+          <w:tcPr>
+            <w:tcW w:type="dxa" w:w="1958"/>
+          </w:tcPr>
+          <w:p>
+            <w:r/>
+            <w:r>
+              <w:rPr>
+                <w:rFonts w:ascii="Calibri" w:hAnsi="Calibri" w:eastAsia="Calibri"/>
+                <w:b w:val="0"/>
+                <w:i w:val="0"/>
+                <w:sz w:val="18"/>
+              </w:rPr>
+              <w:t>Often short answers — confirm</w:t>
             </w:r>
           </w:p>
         </w:tc>
@@ -11721,7 +12533,7 @@
       <w:tr>
         <w:tc>
           <w:tcPr>
-            <w:tcW w:type="dxa" w:w="2448"/>
+            <w:tcW w:type="dxa" w:w="1958"/>
           </w:tcPr>
           <w:p>
             <w:r/>
@@ -11738,7 +12550,7 @@
         </w:tc>
         <w:tc>
           <w:tcPr>
-            <w:tcW w:type="dxa" w:w="2448"/>
+            <w:tcW w:type="dxa" w:w="1958"/>
           </w:tcPr>
           <w:p>
             <w:r/>
@@ -11755,7 +12567,7 @@
         </w:tc>
         <w:tc>
           <w:tcPr>
-            <w:tcW w:type="dxa" w:w="2448"/>
+            <w:tcW w:type="dxa" w:w="1958"/>
           </w:tcPr>
           <w:p>
             <w:r/>
@@ -11772,7 +12584,7 @@
         </w:tc>
         <w:tc>
           <w:tcPr>
-            <w:tcW w:type="dxa" w:w="2448"/>
+            <w:tcW w:type="dxa" w:w="1958"/>
           </w:tcPr>
           <w:p>
             <w:r/>
@@ -11784,6 +12596,23 @@
                 <w:sz w:val="18"/>
               </w:rPr>
               <w:t>Yes</w:t>
+            </w:r>
+          </w:p>
+        </w:tc>
+        <w:tc>
+          <w:tcPr>
+            <w:tcW w:type="dxa" w:w="1958"/>
+          </w:tcPr>
+          <w:p>
+            <w:r/>
+            <w:r>
+              <w:rPr>
+                <w:rFonts w:ascii="Calibri" w:hAnsi="Calibri" w:eastAsia="Calibri"/>
+                <w:b w:val="0"/>
+                <w:i w:val="0"/>
+                <w:sz w:val="18"/>
+              </w:rPr>
+              <w:t>Often short / why — confirm</w:t>
             </w:r>
           </w:p>
         </w:tc>
@@ -11791,7 +12620,7 @@
       <w:tr>
         <w:tc>
           <w:tcPr>
-            <w:tcW w:type="dxa" w:w="2448"/>
+            <w:tcW w:type="dxa" w:w="1958"/>
           </w:tcPr>
           <w:p>
             <w:r/>
@@ -11808,7 +12637,7 @@
         </w:tc>
         <w:tc>
           <w:tcPr>
-            <w:tcW w:type="dxa" w:w="2448"/>
+            <w:tcW w:type="dxa" w:w="1958"/>
           </w:tcPr>
           <w:p>
             <w:r/>
@@ -11825,7 +12654,7 @@
         </w:tc>
         <w:tc>
           <w:tcPr>
-            <w:tcW w:type="dxa" w:w="2448"/>
+            <w:tcW w:type="dxa" w:w="1958"/>
           </w:tcPr>
           <w:p>
             <w:r/>
@@ -11842,7 +12671,7 @@
         </w:tc>
         <w:tc>
           <w:tcPr>
-            <w:tcW w:type="dxa" w:w="2448"/>
+            <w:tcW w:type="dxa" w:w="1958"/>
           </w:tcPr>
           <w:p>
             <w:r/>
@@ -11854,6 +12683,23 @@
                 <w:sz w:val="18"/>
               </w:rPr>
               <w:t>Yes</w:t>
+            </w:r>
+          </w:p>
+        </w:tc>
+        <w:tc>
+          <w:tcPr>
+            <w:tcW w:type="dxa" w:w="1958"/>
+          </w:tcPr>
+          <w:p>
+            <w:r/>
+            <w:r>
+              <w:rPr>
+                <w:rFonts w:ascii="Calibri" w:hAnsi="Calibri" w:eastAsia="Calibri"/>
+                <w:b w:val="0"/>
+                <w:i w:val="0"/>
+                <w:sz w:val="18"/>
+              </w:rPr>
+              <w:t>Usually modest — confirm</w:t>
             </w:r>
           </w:p>
         </w:tc>
@@ -11861,7 +12707,7 @@
       <w:tr>
         <w:tc>
           <w:tcPr>
-            <w:tcW w:type="dxa" w:w="2448"/>
+            <w:tcW w:type="dxa" w:w="1958"/>
           </w:tcPr>
           <w:p>
             <w:r/>
@@ -11878,7 +12724,7 @@
         </w:tc>
         <w:tc>
           <w:tcPr>
-            <w:tcW w:type="dxa" w:w="2448"/>
+            <w:tcW w:type="dxa" w:w="1958"/>
           </w:tcPr>
           <w:p>
             <w:r/>
@@ -11895,7 +12741,7 @@
         </w:tc>
         <w:tc>
           <w:tcPr>
-            <w:tcW w:type="dxa" w:w="2448"/>
+            <w:tcW w:type="dxa" w:w="1958"/>
           </w:tcPr>
           <w:p>
             <w:r/>
@@ -11912,7 +12758,7 @@
         </w:tc>
         <w:tc>
           <w:tcPr>
-            <w:tcW w:type="dxa" w:w="2448"/>
+            <w:tcW w:type="dxa" w:w="1958"/>
           </w:tcPr>
           <w:p>
             <w:r/>
@@ -11924,6 +12770,23 @@
                 <w:sz w:val="18"/>
               </w:rPr>
               <w:t>Yes</w:t>
+            </w:r>
+          </w:p>
+        </w:tc>
+        <w:tc>
+          <w:tcPr>
+            <w:tcW w:type="dxa" w:w="1958"/>
+          </w:tcPr>
+          <w:p>
+            <w:r/>
+            <w:r>
+              <w:rPr>
+                <w:rFonts w:ascii="Calibri" w:hAnsi="Calibri" w:eastAsia="Calibri"/>
+                <w:b w:val="0"/>
+                <w:i w:val="0"/>
+                <w:sz w:val="18"/>
+              </w:rPr>
+              <w:t>Often minimal — confirm</w:t>
             </w:r>
           </w:p>
         </w:tc>
@@ -11931,7 +12794,7 @@
       <w:tr>
         <w:tc>
           <w:tcPr>
-            <w:tcW w:type="dxa" w:w="2448"/>
+            <w:tcW w:type="dxa" w:w="1958"/>
           </w:tcPr>
           <w:p>
             <w:r/>
@@ -11948,7 +12811,7 @@
         </w:tc>
         <w:tc>
           <w:tcPr>
-            <w:tcW w:type="dxa" w:w="2448"/>
+            <w:tcW w:type="dxa" w:w="1958"/>
           </w:tcPr>
           <w:p>
             <w:r/>
@@ -11965,7 +12828,7 @@
         </w:tc>
         <w:tc>
           <w:tcPr>
-            <w:tcW w:type="dxa" w:w="2448"/>
+            <w:tcW w:type="dxa" w:w="1958"/>
           </w:tcPr>
           <w:p>
             <w:r/>
@@ -11982,7 +12845,7 @@
         </w:tc>
         <w:tc>
           <w:tcPr>
-            <w:tcW w:type="dxa" w:w="2448"/>
+            <w:tcW w:type="dxa" w:w="1958"/>
           </w:tcPr>
           <w:p>
             <w:r/>
@@ -11994,6 +12857,23 @@
                 <w:sz w:val="18"/>
               </w:rPr>
               <w:t>Yes</w:t>
+            </w:r>
+          </w:p>
+        </w:tc>
+        <w:tc>
+          <w:tcPr>
+            <w:tcW w:type="dxa" w:w="1958"/>
+          </w:tcPr>
+          <w:p>
+            <w:r/>
+            <w:r>
+              <w:rPr>
+                <w:rFonts w:ascii="Calibri" w:hAnsi="Calibri" w:eastAsia="Calibri"/>
+                <w:b w:val="0"/>
+                <w:i w:val="0"/>
+                <w:sz w:val="18"/>
+              </w:rPr>
+              <w:t>Often optional/light — confirm</w:t>
             </w:r>
           </w:p>
         </w:tc>
@@ -12001,7 +12881,7 @@
       <w:tr>
         <w:tc>
           <w:tcPr>
-            <w:tcW w:type="dxa" w:w="2448"/>
+            <w:tcW w:type="dxa" w:w="1958"/>
           </w:tcPr>
           <w:p>
             <w:r/>
@@ -12018,7 +12898,7 @@
         </w:tc>
         <w:tc>
           <w:tcPr>
-            <w:tcW w:type="dxa" w:w="2448"/>
+            <w:tcW w:type="dxa" w:w="1958"/>
           </w:tcPr>
           <w:p>
             <w:r/>
@@ -12035,7 +12915,7 @@
         </w:tc>
         <w:tc>
           <w:tcPr>
-            <w:tcW w:type="dxa" w:w="2448"/>
+            <w:tcW w:type="dxa" w:w="1958"/>
           </w:tcPr>
           <w:p>
             <w:r/>
@@ -12052,7 +12932,7 @@
         </w:tc>
         <w:tc>
           <w:tcPr>
-            <w:tcW w:type="dxa" w:w="2448"/>
+            <w:tcW w:type="dxa" w:w="1958"/>
           </w:tcPr>
           <w:p>
             <w:r/>
@@ -12064,6 +12944,23 @@
                 <w:sz w:val="18"/>
               </w:rPr>
               <w:t>Yes</w:t>
+            </w:r>
+          </w:p>
+        </w:tc>
+        <w:tc>
+          <w:tcPr>
+            <w:tcW w:type="dxa" w:w="1958"/>
+          </w:tcPr>
+          <w:p>
+            <w:r/>
+            <w:r>
+              <w:rPr>
+                <w:rFonts w:ascii="Calibri" w:hAnsi="Calibri" w:eastAsia="Calibri"/>
+                <w:b w:val="0"/>
+                <w:i w:val="0"/>
+                <w:sz w:val="18"/>
+              </w:rPr>
+              <w:t>Varies — confirm</w:t>
             </w:r>
           </w:p>
         </w:tc>
@@ -12085,14 +12982,15 @@
         <w:tblLook w:firstColumn="1" w:firstRow="1" w:lastColumn="0" w:lastRow="0" w:noHBand="0" w:noVBand="1" w:val="04A0"/>
       </w:tblPr>
       <w:tblGrid>
-        <w:gridCol w:w="3264"/>
-        <w:gridCol w:w="3264"/>
-        <w:gridCol w:w="3264"/>
+        <w:gridCol w:w="2448"/>
+        <w:gridCol w:w="2448"/>
+        <w:gridCol w:w="2448"/>
+        <w:gridCol w:w="2448"/>
       </w:tblGrid>
       <w:tr>
         <w:tc>
           <w:tcPr>
-            <w:tcW w:type="dxa" w:w="3264"/>
+            <w:tcW w:type="dxa" w:w="2448"/>
             <w:shd w:fill="1F4E79" w:val="clear"/>
           </w:tcPr>
           <w:p>
@@ -12116,7 +13014,7 @@
         </w:tc>
         <w:tc>
           <w:tcPr>
-            <w:tcW w:type="dxa" w:w="3264"/>
+            <w:tcW w:type="dxa" w:w="2448"/>
             <w:shd w:fill="1F4E79" w:val="clear"/>
           </w:tcPr>
           <w:p>
@@ -12140,7 +13038,7 @@
         </w:tc>
         <w:tc>
           <w:tcPr>
-            <w:tcW w:type="dxa" w:w="3264"/>
+            <w:tcW w:type="dxa" w:w="2448"/>
             <w:shd w:fill="1F4E79" w:val="clear"/>
           </w:tcPr>
           <w:p>
@@ -12158,7 +13056,31 @@
                 <w:color w:val="FFFFFF"/>
                 <w:sz w:val="18"/>
               </w:rPr>
-              <w:t>Notes</w:t>
+              <w:t>Early options</w:t>
+            </w:r>
+          </w:p>
+        </w:tc>
+        <w:tc>
+          <w:tcPr>
+            <w:tcW w:type="dxa" w:w="2448"/>
+            <w:shd w:fill="1F4E79" w:val="clear"/>
+          </w:tcPr>
+          <w:p>
+            <w:r>
+              <w:rPr>
+                <w:b/>
+                <w:color w:val="FFFFFF"/>
+              </w:rPr>
+            </w:r>
+            <w:r>
+              <w:rPr>
+                <w:rFonts w:ascii="Calibri" w:hAnsi="Calibri" w:eastAsia="Calibri"/>
+                <w:b/>
+                <w:i w:val="0"/>
+                <w:color w:val="FFFFFF"/>
+                <w:sz w:val="18"/>
+              </w:rPr>
+              <w:t>Supplement (typical)</w:t>
             </w:r>
           </w:p>
         </w:tc>
@@ -12166,7 +13088,7 @@
       <w:tr>
         <w:tc>
           <w:tcPr>
-            <w:tcW w:type="dxa" w:w="3264"/>
+            <w:tcW w:type="dxa" w:w="2448"/>
           </w:tcPr>
           <w:p>
             <w:r/>
@@ -12183,7 +13105,7 @@
         </w:tc>
         <w:tc>
           <w:tcPr>
-            <w:tcW w:type="dxa" w:w="3264"/>
+            <w:tcW w:type="dxa" w:w="2448"/>
           </w:tcPr>
           <w:p>
             <w:r/>
@@ -12194,13 +13116,13 @@
                 <w:i w:val="0"/>
                 <w:sz w:val="18"/>
               </w:rPr>
-              <w:t>Strong public; competitive but more realistic than BU/BC</w:t>
-            </w:r>
-          </w:p>
-        </w:tc>
-        <w:tc>
-          <w:tcPr>
-            <w:tcW w:type="dxa" w:w="3264"/>
+              <w:t>Strong public; more realistic than BU/BC</w:t>
+            </w:r>
+          </w:p>
+        </w:tc>
+        <w:tc>
+          <w:tcPr>
+            <w:tcW w:type="dxa" w:w="2448"/>
           </w:tcPr>
           <w:p>
             <w:r/>
@@ -12212,6 +13134,23 @@
                 <w:sz w:val="18"/>
               </w:rPr>
               <w:t>EA</w:t>
+            </w:r>
+          </w:p>
+        </w:tc>
+        <w:tc>
+          <w:tcPr>
+            <w:tcW w:type="dxa" w:w="2448"/>
+          </w:tcPr>
+          <w:p>
+            <w:r/>
+            <w:r>
+              <w:rPr>
+                <w:rFonts w:ascii="Calibri" w:hAnsi="Calibri" w:eastAsia="Calibri"/>
+                <w:b w:val="0"/>
+                <w:i w:val="0"/>
+                <w:sz w:val="18"/>
+              </w:rPr>
+              <w:t>Often short answers — confirm if major fits</w:t>
             </w:r>
           </w:p>
         </w:tc>
@@ -12219,7 +13158,7 @@
       <w:tr>
         <w:tc>
           <w:tcPr>
-            <w:tcW w:type="dxa" w:w="3264"/>
+            <w:tcW w:type="dxa" w:w="2448"/>
           </w:tcPr>
           <w:p>
             <w:r/>
@@ -12236,7 +13175,7 @@
         </w:tc>
         <w:tc>
           <w:tcPr>
-            <w:tcW w:type="dxa" w:w="3264"/>
+            <w:tcW w:type="dxa" w:w="2448"/>
           </w:tcPr>
           <w:p>
             <w:r/>
@@ -12253,7 +13192,7 @@
         </w:tc>
         <w:tc>
           <w:tcPr>
-            <w:tcW w:type="dxa" w:w="3264"/>
+            <w:tcW w:type="dxa" w:w="2448"/>
           </w:tcPr>
           <w:p>
             <w:r/>
@@ -12265,6 +13204,23 @@
                 <w:sz w:val="18"/>
               </w:rPr>
               <w:t>EA</w:t>
+            </w:r>
+          </w:p>
+        </w:tc>
+        <w:tc>
+          <w:tcPr>
+            <w:tcW w:type="dxa" w:w="2448"/>
+          </w:tcPr>
+          <w:p>
+            <w:r/>
+            <w:r>
+              <w:rPr>
+                <w:rFonts w:ascii="Calibri" w:hAnsi="Calibri" w:eastAsia="Calibri"/>
+                <w:b w:val="0"/>
+                <w:i w:val="0"/>
+                <w:sz w:val="18"/>
+              </w:rPr>
+              <w:t>Often light — confirm</w:t>
             </w:r>
           </w:p>
         </w:tc>
@@ -12272,7 +13228,7 @@
       <w:tr>
         <w:tc>
           <w:tcPr>
-            <w:tcW w:type="dxa" w:w="3264"/>
+            <w:tcW w:type="dxa" w:w="2448"/>
           </w:tcPr>
           <w:p>
             <w:r/>
@@ -12289,7 +13245,7 @@
         </w:tc>
         <w:tc>
           <w:tcPr>
-            <w:tcW w:type="dxa" w:w="3264"/>
+            <w:tcW w:type="dxa" w:w="2448"/>
           </w:tcPr>
           <w:p>
             <w:r/>
@@ -12300,13 +13256,13 @@
                 <w:i w:val="0"/>
                 <w:sz w:val="18"/>
               </w:rPr>
-              <w:t>Urban research; ED/EA options</w:t>
-            </w:r>
-          </w:p>
-        </w:tc>
-        <w:tc>
-          <w:tcPr>
-            <w:tcW w:type="dxa" w:w="3264"/>
+              <w:t>Urban research</w:t>
+            </w:r>
+          </w:p>
+        </w:tc>
+        <w:tc>
+          <w:tcPr>
+            <w:tcW w:type="dxa" w:w="2448"/>
           </w:tcPr>
           <w:p>
             <w:r/>
@@ -12317,7 +13273,24 @@
                 <w:i w:val="0"/>
                 <w:sz w:val="18"/>
               </w:rPr>
-              <w:t>Check plan</w:t>
+              <w:t>ED/EA options</w:t>
+            </w:r>
+          </w:p>
+        </w:tc>
+        <w:tc>
+          <w:tcPr>
+            <w:tcW w:type="dxa" w:w="2448"/>
+          </w:tcPr>
+          <w:p>
+            <w:r/>
+            <w:r>
+              <w:rPr>
+                <w:rFonts w:ascii="Calibri" w:hAnsi="Calibri" w:eastAsia="Calibri"/>
+                <w:b w:val="0"/>
+                <w:i w:val="0"/>
+                <w:sz w:val="18"/>
+              </w:rPr>
+              <w:t>Often short / why — confirm</w:t>
             </w:r>
           </w:p>
         </w:tc>
@@ -12325,7 +13298,7 @@
       <w:tr>
         <w:tc>
           <w:tcPr>
-            <w:tcW w:type="dxa" w:w="3264"/>
+            <w:tcW w:type="dxa" w:w="2448"/>
           </w:tcPr>
           <w:p>
             <w:r/>
@@ -12342,7 +13315,7 @@
         </w:tc>
         <w:tc>
           <w:tcPr>
-            <w:tcW w:type="dxa" w:w="3264"/>
+            <w:tcW w:type="dxa" w:w="2448"/>
           </w:tcPr>
           <w:p>
             <w:r/>
@@ -12359,7 +13332,7 @@
         </w:tc>
         <w:tc>
           <w:tcPr>
-            <w:tcW w:type="dxa" w:w="3264"/>
+            <w:tcW w:type="dxa" w:w="2448"/>
           </w:tcPr>
           <w:p>
             <w:r/>
@@ -12371,6 +13344,23 @@
                 <w:sz w:val="18"/>
               </w:rPr>
               <w:t>Often EA</w:t>
+            </w:r>
+          </w:p>
+        </w:tc>
+        <w:tc>
+          <w:tcPr>
+            <w:tcW w:type="dxa" w:w="2448"/>
+          </w:tcPr>
+          <w:p>
+            <w:r/>
+            <w:r>
+              <w:rPr>
+                <w:rFonts w:ascii="Calibri" w:hAnsi="Calibri" w:eastAsia="Calibri"/>
+                <w:b w:val="0"/>
+                <w:i w:val="0"/>
+                <w:sz w:val="18"/>
+              </w:rPr>
+              <w:t>Varies by campus — confirm if major fits</w:t>
             </w:r>
           </w:p>
         </w:tc>
@@ -12378,7 +13368,7 @@
       <w:tr>
         <w:tc>
           <w:tcPr>
-            <w:tcW w:type="dxa" w:w="3264"/>
+            <w:tcW w:type="dxa" w:w="2448"/>
           </w:tcPr>
           <w:p>
             <w:r/>
@@ -12395,7 +13385,7 @@
         </w:tc>
         <w:tc>
           <w:tcPr>
-            <w:tcW w:type="dxa" w:w="3264"/>
+            <w:tcW w:type="dxa" w:w="2448"/>
           </w:tcPr>
           <w:p>
             <w:r/>
@@ -12412,7 +13402,7 @@
         </w:tc>
         <w:tc>
           <w:tcPr>
-            <w:tcW w:type="dxa" w:w="3264"/>
+            <w:tcW w:type="dxa" w:w="2448"/>
           </w:tcPr>
           <w:p>
             <w:r/>
@@ -12424,6 +13414,23 @@
                 <w:sz w:val="18"/>
               </w:rPr>
               <w:t>EA</w:t>
+            </w:r>
+          </w:p>
+        </w:tc>
+        <w:tc>
+          <w:tcPr>
+            <w:tcW w:type="dxa" w:w="2448"/>
+          </w:tcPr>
+          <w:p>
+            <w:r/>
+            <w:r>
+              <w:rPr>
+                <w:rFonts w:ascii="Calibri" w:hAnsi="Calibri" w:eastAsia="Calibri"/>
+                <w:b w:val="0"/>
+                <w:i w:val="0"/>
+                <w:sz w:val="18"/>
+              </w:rPr>
+              <w:t>Often light — confirm if co-op/STEM fit</w:t>
             </w:r>
           </w:p>
         </w:tc>
@@ -12431,7 +13438,7 @@
       <w:tr>
         <w:tc>
           <w:tcPr>
-            <w:tcW w:type="dxa" w:w="3264"/>
+            <w:tcW w:type="dxa" w:w="2448"/>
           </w:tcPr>
           <w:p>
             <w:r/>
@@ -12448,7 +13455,7 @@
         </w:tc>
         <w:tc>
           <w:tcPr>
-            <w:tcW w:type="dxa" w:w="3264"/>
+            <w:tcW w:type="dxa" w:w="2448"/>
           </w:tcPr>
           <w:p>
             <w:r/>
@@ -12465,7 +13472,7 @@
         </w:tc>
         <w:tc>
           <w:tcPr>
-            <w:tcW w:type="dxa" w:w="3264"/>
+            <w:tcW w:type="dxa" w:w="2448"/>
           </w:tcPr>
           <w:p>
             <w:r/>
@@ -12477,6 +13484,23 @@
                 <w:sz w:val="18"/>
               </w:rPr>
               <w:t>Varies</w:t>
+            </w:r>
+          </w:p>
+        </w:tc>
+        <w:tc>
+          <w:tcPr>
+            <w:tcW w:type="dxa" w:w="2448"/>
+          </w:tcPr>
+          <w:p>
+            <w:r/>
+            <w:r>
+              <w:rPr>
+                <w:rFonts w:ascii="Calibri" w:hAnsi="Calibri" w:eastAsia="Calibri"/>
+                <w:b w:val="0"/>
+                <w:i w:val="0"/>
+                <w:sz w:val="18"/>
+              </w:rPr>
+              <w:t>Usually light — confirm campus</w:t>
             </w:r>
           </w:p>
         </w:tc>

</xml_diff>